<commit_message>
Fix: add authors (Anuradha Brijwal, Praveena Chaturvedi) to paper
</commit_message>
<xml_diff>
--- a/RobustCrop_Paper.docx
+++ b/RobustCrop_Paper.docx
@@ -2,47 +2,6 @@
 <file path=word/document.xml><?xml version="1.0" encoding="utf-8"?>
 <w:document xmlns:w="http://schemas.openxmlformats.org/wordprocessingml/2006/main" xmlns:m="http://schemas.openxmlformats.org/officeDocument/2006/math" xmlns:r="http://schemas.openxmlformats.org/officeDocument/2006/relationships" xmlns:o="urn:schemas-microsoft-com:office:office" xmlns:v="urn:schemas-microsoft-com:vml" xmlns:w10="urn:schemas-microsoft-com:office:word" xmlns:a="http://schemas.openxmlformats.org/drawingml/2006/main" xmlns:pic="http://schemas.openxmlformats.org/drawingml/2006/picture" xmlns:wp="http://schemas.openxmlformats.org/drawingml/2006/wordprocessingDrawing">
   <w:body>
-    <w:p>
-      <w:pPr>
-        <w:pStyle w:val="Title"/>
-      </w:pPr>
-      <w:r>
-        <w:t xml:space="preserve">RobustCrop: A Leak-Free Machine Learning Pipeline for Crop Recommendation with Sensor Degradation Analysis and Cross-Dataset Feature Consistency</w:t>
-      </w:r>
-    </w:p>
-    <w:p>
-      <w:pPr>
-        <w:pStyle w:val="Date"/>
-      </w:pPr>
-      <w:r>
-        <w:t xml:space="preserve">2026</w:t>
-      </w:r>
-    </w:p>
-    <w:p>
-      <w:pPr>
-        <w:pStyle w:val="AbstractTitle"/>
-      </w:pPr>
-      <w:r>
-        <w:t xml:space="preserve">Abstract</w:t>
-      </w:r>
-    </w:p>
-    <w:p>
-      <w:pPr>
-        <w:pStyle w:val="Abstract"/>
-      </w:pPr>
-      <w:r>
-        <w:t xml:space="preserve">Deploying machine learning for crop recommendation in real agricultural settings requires addressing three practical challenges overlooked by prior work: data leakage in preprocessing pipelines, class imbalance in real-world soil data, and over-reliance on semi-synthetic benchmarks without external validation. This paper proposes RobustCrop, a leak-free pipeline that encapsulates feature scaling, mutual-information-based feature selection, and classification within a single scikit-learn Pipeline per cross-validation fold, eliminating the information leakage that inflates accuracy in prior studies. A BalWeightWrapper provides sample_weight=</w:t>
-      </w:r>
-      <w:r>
-        <w:t xml:space="preserve">‘balanced’</w:t>
-      </w:r>
-      <w:r>
-        <w:t xml:space="preserve"> </w:t>
-      </w:r>
-      <w:r>
-        <w:t xml:space="preserve">imbalance correction for all classifiers — including those without native class_weight support (XGBoost, Gradient Boosting, MLP, KNN, GaussianNB) — ensuring fair comparison. Optional Optuna-based nested CV (30 trials, 3-fold inner loop) enables systematic hyperparameter tuning. We evaluate on two datasets: a primary crop recommendation dataset (2,200 samples, 22 semi-synthetic classes) and a real-world soil fertility dataset (880 samples, 3 classes, 11.28:1 imbalance ratio). On real-world data, the proposed Random Forest pipeline achieves 91.25% ± 0.77% accuracy (κ = 0.8364, macro-F1 = 81.85%), outperforming nine benchmark classifiers. SHAP analysis identifies humidity and rainfall as dominant predictors, with potassium and nitrogen as key soil nutrient differentiators. Literature-grounded sensor degradation analysis under monotonic drift shows decay from 94.05% (7-day) to 16.09% (90-day drift), establishing that weekly recalibration maintains &gt;94% accuracy. Cross-dataset feature consistency analysis reveals phosphorus as the most transferable feature (consistency = 0.804) while potassium importance is task-dependent (0.293). A Friedman test across classifiers confirms statistically significant differences (χ² = 32.32, p &lt; 0.001). These findings provide actionable deployment guidance for ML-based crop recommendation in resource-constrained agricultural IoT settings.</w:t>
-      </w:r>
-    </w:p>
     <w:sdt>
       <w:sdtPr>
         <w:docPartObj>
@@ -69,7 +28,7 @@
         </w:p>
       </w:sdtContent>
     </w:sdt>
-    <w:bookmarkStart w:id="22" w:name="introduction"/>
+    <w:bookmarkStart w:id="21" w:name="X49fff7aa50474b71656d21e10a557bccb3864b2"/>
     <w:p>
       <w:pPr>
         <w:pStyle w:val="Heading1"/>
@@ -84,10 +43,267 @@
         <w:tab/>
       </w:r>
       <w:r>
+        <w:t xml:space="preserve">RobustCrop: A Leak-Free Machine Learning Pipeline for Crop Recommendation with Sensor Degradation Analysis and Cross-Dataset Feature Consistency</w:t>
+      </w:r>
+    </w:p>
+    <w:p>
+      <w:pPr>
+        <w:pStyle w:val="FirstParagraph"/>
+      </w:pPr>
+      <w:r>
+        <w:rPr>
+          <w:b/>
+          <w:bCs/>
+        </w:rPr>
+        <w:t xml:space="preserve">Anuradha Brijwal</w:t>
+      </w:r>
+      <w:r>
+        <w:rPr>
+          <w:b/>
+          <w:bCs/>
+          <w:vertAlign w:val="superscript"/>
+        </w:rPr>
+        <w:t xml:space="preserve">1</w:t>
+      </w:r>
+      <w:r>
+        <w:rPr>
+          <w:b/>
+          <w:bCs/>
+        </w:rPr>
+        <w:t xml:space="preserve"> </w:t>
+      </w:r>
+      <w:r>
+        <w:rPr>
+          <w:b/>
+          <w:bCs/>
+        </w:rPr>
+        <w:t xml:space="preserve">· Praveena Chaturvedi</w:t>
+      </w:r>
+      <w:r>
+        <w:rPr>
+          <w:b/>
+          <w:bCs/>
+          <w:vertAlign w:val="superscript"/>
+        </w:rPr>
+        <w:t xml:space="preserve">2</w:t>
+      </w:r>
+    </w:p>
+    <w:p>
+      <w:pPr>
+        <w:pStyle w:val="BodyText"/>
+      </w:pPr>
+      <w:r>
+        <w:rPr>
+          <w:vertAlign w:val="superscript"/>
+        </w:rPr>
+        <w:t xml:space="preserve">1</w:t>
+      </w:r>
+      <w:r>
+        <w:t xml:space="preserve"> </w:t>
+      </w:r>
+      <w:r>
+        <w:t xml:space="preserve">Research Scholar, Department of Computer Science, Kanya Gurukul Campus Dehradun</w:t>
+      </w:r>
+    </w:p>
+    <w:p>
+      <w:pPr>
+        <w:pStyle w:val="BodyText"/>
+      </w:pPr>
+      <w:r>
+        <w:rPr>
+          <w:vertAlign w:val="superscript"/>
+        </w:rPr>
+        <w:t xml:space="preserve">2</w:t>
+      </w:r>
+      <w:r>
+        <w:t xml:space="preserve"> </w:t>
+      </w:r>
+      <w:r>
+        <w:t xml:space="preserve">Professor, Department of Computer Science, Kanya Gurukul Campus Dehradun</w:t>
+      </w:r>
+    </w:p>
+    <w:p>
+      <w:pPr>
+        <w:pStyle w:val="BodyText"/>
+      </w:pPr>
+      <w:r>
+        <w:rPr>
+          <w:i/>
+          <w:iCs/>
+        </w:rPr>
+        <w:t xml:space="preserve">Gurukul Kangri (Deemed to be University), Haridwar, Uttarakhand, India</w:t>
+      </w:r>
+    </w:p>
+    <w:p>
+      <w:r>
+        <w:pict>
+          <v:rect style="width:0;height:1.5pt" o:hralign="center" o:hrstd="t" o:hr="t"/>
+        </w:pict>
+      </w:r>
+    </w:p>
+    <w:bookmarkStart w:id="20" w:name="abstract"/>
+    <w:p>
+      <w:pPr>
+        <w:pStyle w:val="Heading2"/>
+      </w:pPr>
+      <w:r>
+        <w:rPr>
+          <w:rStyle w:val="SectionNumber"/>
+        </w:rPr>
+        <w:t xml:space="preserve">1.1</w:t>
+      </w:r>
+      <w:r>
+        <w:tab/>
+      </w:r>
+      <w:r>
+        <w:t xml:space="preserve">Abstract</w:t>
+      </w:r>
+    </w:p>
+    <w:p>
+      <w:pPr>
+        <w:pStyle w:val="FirstParagraph"/>
+      </w:pPr>
+      <w:r>
+        <w:t xml:space="preserve">Deploying machine learning for crop recommendation in real agricultural settings requires addressing three practical challenges overlooked by prior work: data leakage in preprocessing pipelines, class imbalance in real-world soil data, and over-reliance on semi-synthetic benchmarks without external validation. This paper proposes</w:t>
+      </w:r>
+      <w:r>
+        <w:t xml:space="preserve"> </w:t>
+      </w:r>
+      <w:r>
+        <w:rPr>
+          <w:b/>
+          <w:bCs/>
+        </w:rPr>
+        <w:t xml:space="preserve">RobustCrop</w:t>
+      </w:r>
+      <w:r>
+        <w:t xml:space="preserve">, a leak-free pipeline that encapsulates feature scaling, mutual-information-based feature selection, and classification within a single scikit-learn Pipeline per cross-validation fold, eliminating the information leakage that inflates accuracy in prior studies. A</w:t>
+      </w:r>
+      <w:r>
+        <w:t xml:space="preserve"> </w:t>
+      </w:r>
+      <w:r>
+        <w:rPr>
+          <w:b/>
+          <w:bCs/>
+        </w:rPr>
+        <w:t xml:space="preserve">BalWeightWrapper</w:t>
+      </w:r>
+      <w:r>
+        <w:t xml:space="preserve"> </w:t>
+      </w:r>
+      <w:r>
+        <w:t xml:space="preserve">provides</w:t>
+      </w:r>
+      <w:r>
+        <w:t xml:space="preserve"> </w:t>
+      </w:r>
+      <w:r>
+        <w:rPr>
+          <w:rStyle w:val="VerbatimChar"/>
+        </w:rPr>
+        <w:t xml:space="preserve">sample_weight='balanced'</w:t>
+      </w:r>
+      <w:r>
+        <w:t xml:space="preserve"> </w:t>
+      </w:r>
+      <w:r>
+        <w:t xml:space="preserve">imbalance correction for all classifiers — including those without native</w:t>
+      </w:r>
+      <w:r>
+        <w:t xml:space="preserve"> </w:t>
+      </w:r>
+      <w:r>
+        <w:rPr>
+          <w:rStyle w:val="VerbatimChar"/>
+        </w:rPr>
+        <w:t xml:space="preserve">class_weight</w:t>
+      </w:r>
+      <w:r>
+        <w:t xml:space="preserve"> </w:t>
+      </w:r>
+      <w:r>
+        <w:t xml:space="preserve">support (XGBoost, Gradient Boosting, MLP, KNN, GaussianNB) — ensuring fair comparison. Optional</w:t>
+      </w:r>
+      <w:r>
+        <w:t xml:space="preserve"> </w:t>
+      </w:r>
+      <w:r>
+        <w:rPr>
+          <w:b/>
+          <w:bCs/>
+        </w:rPr>
+        <w:t xml:space="preserve">Optuna-based nested CV</w:t>
+      </w:r>
+      <w:r>
+        <w:t xml:space="preserve"> </w:t>
+      </w:r>
+      <w:r>
+        <w:t xml:space="preserve">(30 trials, 3-fold inner loop) enables systematic hyperparameter tuning. We evaluate on two datasets: a primary crop recommendation dataset (2,200 samples, 22 semi-synthetic classes) and a real-world soil fertility dataset (880 samples, 3 classes, 11.28:1 imbalance ratio). On real-world data, the proposed Random Forest pipeline achieves</w:t>
+      </w:r>
+      <w:r>
+        <w:t xml:space="preserve"> </w:t>
+      </w:r>
+      <w:r>
+        <w:rPr>
+          <w:b/>
+          <w:bCs/>
+        </w:rPr>
+        <w:t xml:space="preserve">91.25% ± 0.77% accuracy</w:t>
+      </w:r>
+      <w:r>
+        <w:t xml:space="preserve"> </w:t>
+      </w:r>
+      <w:r>
+        <w:t xml:space="preserve">(κ = 0.8364, macro-F1 = 81.85%), outperforming nine benchmark classifiers. SHAP analysis identifies humidity and rainfall as dominant predictors, with potassium and nitrogen as key soil nutrient differentiators. Literature-grounded sensor degradation analysis under monotonic drift shows decay from 94.05% (7-day) to 16.09% (90-day drift), establishing that weekly recalibration maintains &gt;94% accuracy. Cross-dataset feature consistency analysis reveals phosphorus as the most transferable feature (consistency = 0.804) while potassium importance is task-dependent (0.293). A Friedman test across classifiers confirms statistically significant differences (χ² = 32.32, p &lt; 0.001). These findings provide actionable deployment guidance for ML-based crop recommendation in resource-constrained agricultural IoT settings.</w:t>
+      </w:r>
+    </w:p>
+    <w:p>
+      <w:pPr>
+        <w:pStyle w:val="BodyText"/>
+      </w:pPr>
+      <w:r>
+        <w:rPr>
+          <w:b/>
+          <w:bCs/>
+        </w:rPr>
+        <w:t xml:space="preserve">Keywords:</w:t>
+      </w:r>
+      <w:r>
+        <w:t xml:space="preserve"> </w:t>
+      </w:r>
+      <w:r>
+        <w:t xml:space="preserve">Crop Recommendation, Feature Selection, Soil Nutrients, Precision Agriculture, Machine Learning, Sensor Degradation, SHAP Explainability, Cross-Dataset Analysis, Class Imbalance, Hyperparameter Tuning</w:t>
+      </w:r>
+    </w:p>
+    <w:p>
+      <w:r>
+        <w:pict>
+          <v:rect style="width:0;height:1.5pt" o:hralign="center" o:hrstd="t" o:hr="t"/>
+        </w:pict>
+      </w:r>
+    </w:p>
+    <w:bookmarkEnd w:id="20"/>
+    <w:bookmarkEnd w:id="21"/>
+    <w:bookmarkStart w:id="24" w:name="introduction"/>
+    <w:p>
+      <w:pPr>
+        <w:pStyle w:val="Heading1"/>
+      </w:pPr>
+      <w:r>
+        <w:rPr>
+          <w:rStyle w:val="SectionNumber"/>
+        </w:rPr>
+        <w:t xml:space="preserve">2</w:t>
+      </w:r>
+      <w:r>
+        <w:tab/>
+      </w:r>
+      <w:r>
         <w:t xml:space="preserve">Introduction</w:t>
       </w:r>
     </w:p>
-    <w:bookmarkStart w:id="20" w:name="background"/>
+    <w:bookmarkStart w:id="22" w:name="background"/>
     <w:p>
       <w:pPr>
         <w:pStyle w:val="Heading2"/>
@@ -96,7 +312,7 @@
         <w:rPr>
           <w:rStyle w:val="SectionNumber"/>
         </w:rPr>
-        <w:t xml:space="preserve">1.1</w:t>
+        <w:t xml:space="preserve">2.1</w:t>
       </w:r>
       <w:r>
         <w:tab/>
@@ -197,8 +413,8 @@
         <w:t xml:space="preserve">Nearly all crop recommendation studies rely on a single semi-synthetic benchmark without validating on independent real-world data or analysing whether feature importance rankings transfer across datasets.</w:t>
       </w:r>
     </w:p>
-    <w:bookmarkEnd w:id="20"/>
-    <w:bookmarkStart w:id="21" w:name="contributions"/>
+    <w:bookmarkEnd w:id="22"/>
+    <w:bookmarkStart w:id="23" w:name="contributions"/>
     <w:p>
       <w:pPr>
         <w:pStyle w:val="Heading2"/>
@@ -207,7 +423,7 @@
         <w:rPr>
           <w:rStyle w:val="SectionNumber"/>
         </w:rPr>
-        <w:t xml:space="preserve">1.2</w:t>
+        <w:t xml:space="preserve">2.2</w:t>
       </w:r>
       <w:r>
         <w:tab/>
@@ -465,9 +681,9 @@
         <w:t xml:space="preserve">identifying which features rank reliably across datasets.</w:t>
       </w:r>
     </w:p>
-    <w:bookmarkEnd w:id="21"/>
-    <w:bookmarkEnd w:id="22"/>
-    <w:bookmarkStart w:id="27" w:name="related-work"/>
+    <w:bookmarkEnd w:id="23"/>
+    <w:bookmarkEnd w:id="24"/>
+    <w:bookmarkStart w:id="29" w:name="related-work"/>
     <w:p>
       <w:pPr>
         <w:pStyle w:val="Heading1"/>
@@ -476,7 +692,7 @@
         <w:rPr>
           <w:rStyle w:val="SectionNumber"/>
         </w:rPr>
-        <w:t xml:space="preserve">2</w:t>
+        <w:t xml:space="preserve">3</w:t>
       </w:r>
       <w:r>
         <w:tab/>
@@ -485,7 +701,7 @@
         <w:t xml:space="preserve">Related Work</w:t>
       </w:r>
     </w:p>
-    <w:bookmarkStart w:id="23" w:name="machine-learning-for-crop-recommendation"/>
+    <w:bookmarkStart w:id="25" w:name="machine-learning-for-crop-recommendation"/>
     <w:p>
       <w:pPr>
         <w:pStyle w:val="Heading2"/>
@@ -494,7 +710,7 @@
         <w:rPr>
           <w:rStyle w:val="SectionNumber"/>
         </w:rPr>
-        <w:t xml:space="preserve">2.1</w:t>
+        <w:t xml:space="preserve">3.1</w:t>
       </w:r>
       <w:r>
         <w:tab/>
@@ -547,8 +763,8 @@
         <w:t xml:space="preserve">provided a comprehensive survey of deep learning in agriculture, highlighting the growing adoption of ML techniques across the agricultural domain.</w:t>
       </w:r>
     </w:p>
-    <w:bookmarkEnd w:id="23"/>
-    <w:bookmarkStart w:id="24" w:name="feature-selection-in-agricultural-data"/>
+    <w:bookmarkEnd w:id="25"/>
+    <w:bookmarkStart w:id="26" w:name="feature-selection-in-agricultural-data"/>
     <w:p>
       <w:pPr>
         <w:pStyle w:val="Heading2"/>
@@ -557,7 +773,7 @@
         <w:rPr>
           <w:rStyle w:val="SectionNumber"/>
         </w:rPr>
-        <w:t xml:space="preserve">2.2</w:t>
+        <w:t xml:space="preserve">3.2</w:t>
       </w:r>
       <w:r>
         <w:tab/>
@@ -595,8 +811,8 @@
         <w:t xml:space="preserve">. Our work synthesises six methods into a consensus ranking and analyses feature importance transferability across datasets.</w:t>
       </w:r>
     </w:p>
-    <w:bookmarkEnd w:id="24"/>
-    <w:bookmarkStart w:id="25" w:name="data-leakage-in-ml-pipelines"/>
+    <w:bookmarkEnd w:id="26"/>
+    <w:bookmarkStart w:id="27" w:name="data-leakage-in-ml-pipelines"/>
     <w:p>
       <w:pPr>
         <w:pStyle w:val="Heading2"/>
@@ -605,7 +821,7 @@
         <w:rPr>
           <w:rStyle w:val="SectionNumber"/>
         </w:rPr>
-        <w:t xml:space="preserve">2.3</w:t>
+        <w:t xml:space="preserve">3.3</w:t>
       </w:r>
       <w:r>
         <w:tab/>
@@ -634,8 +850,8 @@
         <w:t xml:space="preserve">documented leakage in 229 out of 329 papers across 17 application domains. Common leakage sources include feature scaling before train-test splitting and feature selection on the full dataset before cross-validation. Our Pipeline-per-fold architecture directly addresses these leakage vectors.</w:t>
       </w:r>
     </w:p>
-    <w:bookmarkEnd w:id="25"/>
-    <w:bookmarkStart w:id="26" w:name="sensor-reliability-in-agricultural-iot"/>
+    <w:bookmarkEnd w:id="27"/>
+    <w:bookmarkStart w:id="28" w:name="sensor-reliability-in-agricultural-iot"/>
     <w:p>
       <w:pPr>
         <w:pStyle w:val="Heading2"/>
@@ -644,7 +860,7 @@
         <w:rPr>
           <w:rStyle w:val="SectionNumber"/>
         </w:rPr>
-        <w:t xml:space="preserve">2.4</w:t>
+        <w:t xml:space="preserve">3.4</w:t>
       </w:r>
       <w:r>
         <w:tab/>
@@ -694,9 +910,9 @@
         <w:t xml:space="preserve">report pH electrode drift of 0.1% per day. Sensor drift is typically monotonic and directional — electrochemical sensors lose sensitivity over time.</w:t>
       </w:r>
     </w:p>
-    <w:bookmarkEnd w:id="26"/>
-    <w:bookmarkEnd w:id="27"/>
-    <w:bookmarkStart w:id="32" w:name="datasets"/>
+    <w:bookmarkEnd w:id="28"/>
+    <w:bookmarkEnd w:id="29"/>
+    <w:bookmarkStart w:id="34" w:name="datasets"/>
     <w:p>
       <w:pPr>
         <w:pStyle w:val="Heading1"/>
@@ -705,7 +921,7 @@
         <w:rPr>
           <w:rStyle w:val="SectionNumber"/>
         </w:rPr>
-        <w:t xml:space="preserve">3</w:t>
+        <w:t xml:space="preserve">4</w:t>
       </w:r>
       <w:r>
         <w:tab/>
@@ -714,7 +930,7 @@
         <w:t xml:space="preserve">Datasets</w:t>
       </w:r>
     </w:p>
-    <w:bookmarkStart w:id="28" w:name="X837f4cbbc23ad4505e6820269a88f916dbd857b"/>
+    <w:bookmarkStart w:id="30" w:name="X837f4cbbc23ad4505e6820269a88f916dbd857b"/>
     <w:p>
       <w:pPr>
         <w:pStyle w:val="Heading2"/>
@@ -723,7 +939,7 @@
         <w:rPr>
           <w:rStyle w:val="SectionNumber"/>
         </w:rPr>
-        <w:t xml:space="preserve">3.1</w:t>
+        <w:t xml:space="preserve">4.1</w:t>
       </w:r>
       <w:r>
         <w:tab/>
@@ -920,8 +1136,8 @@
         </w:tc>
       </w:tr>
     </w:tbl>
-    <w:bookmarkEnd w:id="28"/>
-    <w:bookmarkStart w:id="29" w:name="Xc574310f826b52be0ca8de9c90bef7492834827"/>
+    <w:bookmarkEnd w:id="30"/>
+    <w:bookmarkStart w:id="31" w:name="Xc574310f826b52be0ca8de9c90bef7492834827"/>
     <w:p>
       <w:pPr>
         <w:pStyle w:val="Heading2"/>
@@ -930,7 +1146,7 @@
         <w:rPr>
           <w:rStyle w:val="SectionNumber"/>
         </w:rPr>
-        <w:t xml:space="preserve">3.2</w:t>
+        <w:t xml:space="preserve">4.2</w:t>
       </w:r>
       <w:r>
         <w:tab/>
@@ -1182,8 +1398,8 @@
         </w:tc>
       </w:tr>
     </w:tbl>
-    <w:bookmarkEnd w:id="29"/>
-    <w:bookmarkStart w:id="30" w:name="shared-feature-space"/>
+    <w:bookmarkEnd w:id="31"/>
+    <w:bookmarkStart w:id="32" w:name="shared-feature-space"/>
     <w:p>
       <w:pPr>
         <w:pStyle w:val="Heading2"/>
@@ -1192,7 +1408,7 @@
         <w:rPr>
           <w:rStyle w:val="SectionNumber"/>
         </w:rPr>
-        <w:t xml:space="preserve">3.3</w:t>
+        <w:t xml:space="preserve">4.3</w:t>
       </w:r>
       <w:r>
         <w:tab/>
@@ -1209,8 +1425,8 @@
         <w:t xml:space="preserve">Both datasets share N, P, K as common features, with pH as a close match. This shared space enables cross-dataset feature consistency analysis (Section 5.7).</w:t>
       </w:r>
     </w:p>
-    <w:bookmarkEnd w:id="30"/>
-    <w:bookmarkStart w:id="31" w:name="sensor-degradation-variants"/>
+    <w:bookmarkEnd w:id="32"/>
+    <w:bookmarkStart w:id="33" w:name="sensor-degradation-variants"/>
     <w:p>
       <w:pPr>
         <w:pStyle w:val="Heading2"/>
@@ -1219,7 +1435,7 @@
         <w:rPr>
           <w:rStyle w:val="SectionNumber"/>
         </w:rPr>
-        <w:t xml:space="preserve">3.4</w:t>
+        <w:t xml:space="preserve">4.4</w:t>
       </w:r>
       <w:r>
         <w:tab/>
@@ -1693,9 +1909,9 @@
         <w:t xml:space="preserve">Three degradation scenarios are generated: mild (7-day), moderate (30-day), and severe (90-day) deployments, with realistic dropout rates (2–10% scaled to deployment duration).</w:t>
       </w:r>
     </w:p>
-    <w:bookmarkEnd w:id="31"/>
-    <w:bookmarkEnd w:id="32"/>
-    <w:bookmarkStart w:id="45" w:name="proposed-method-robustcrop-pipeline"/>
+    <w:bookmarkEnd w:id="33"/>
+    <w:bookmarkEnd w:id="34"/>
+    <w:bookmarkStart w:id="47" w:name="proposed-method-robustcrop-pipeline"/>
     <w:p>
       <w:pPr>
         <w:pStyle w:val="Heading1"/>
@@ -1704,7 +1920,7 @@
         <w:rPr>
           <w:rStyle w:val="SectionNumber"/>
         </w:rPr>
-        <w:t xml:space="preserve">4</w:t>
+        <w:t xml:space="preserve">5</w:t>
       </w:r>
       <w:r>
         <w:tab/>
@@ -1713,7 +1929,7 @@
         <w:t xml:space="preserve">Proposed Method: RobustCrop Pipeline</w:t>
       </w:r>
     </w:p>
-    <w:bookmarkStart w:id="37" w:name="system-overview"/>
+    <w:bookmarkStart w:id="39" w:name="system-overview"/>
     <w:p>
       <w:pPr>
         <w:pStyle w:val="Heading2"/>
@@ -1722,7 +1938,7 @@
         <w:rPr>
           <w:rStyle w:val="SectionNumber"/>
         </w:rPr>
-        <w:t xml:space="preserve">4.1</w:t>
+        <w:t xml:space="preserve">5.1</w:t>
       </w:r>
       <w:r>
         <w:tab/>
@@ -1761,7 +1977,7 @@
         <w:t xml:space="preserve">. The system architecture is illustrated in Figure 1.</w:t>
       </w:r>
     </w:p>
-    <w:bookmarkStart w:id="36" w:name="fig:arch"/>
+    <w:bookmarkStart w:id="38" w:name="fig:arch"/>
     <w:p>
       <w:pPr>
         <w:pStyle w:val="CaptionedFigure"/>
@@ -1771,18 +1987,18 @@
           <wp:inline>
             <wp:extent cx="5334000" cy="2642293"/>
             <wp:effectExtent b="0" l="0" r="0" t="0"/>
-            <wp:docPr descr="System architecture of the RobustCrop pipeline showing the leak-free per-fold design." title="" id="34" name="Picture"/>
+            <wp:docPr descr="System architecture of the RobustCrop pipeline showing the leak-free per-fold design." title="" id="36" name="Picture"/>
             <a:graphic>
               <a:graphicData uri="http://schemas.openxmlformats.org/drawingml/2006/picture">
                 <pic:pic>
                   <pic:nvPicPr>
-                    <pic:cNvPr descr="01_primary_distributions.png" id="35" name="Picture"/>
+                    <pic:cNvPr descr="01_primary_distributions.png" id="37" name="Picture"/>
                     <pic:cNvPicPr>
                       <a:picLocks noChangeArrowheads="1" noChangeAspect="1"/>
                     </pic:cNvPicPr>
                   </pic:nvPicPr>
                   <pic:blipFill>
-                    <a:blip r:embed="rId33"/>
+                    <a:blip r:embed="rId35"/>
                     <a:stretch>
                       <a:fillRect/>
                     </a:stretch>
@@ -1817,9 +2033,9 @@
         <w:t xml:space="preserve">System architecture of the RobustCrop pipeline showing the leak-free per-fold design.</w:t>
       </w:r>
     </w:p>
-    <w:bookmarkEnd w:id="36"/>
-    <w:bookmarkEnd w:id="37"/>
-    <w:bookmarkStart w:id="38" w:name="data-preprocessing"/>
+    <w:bookmarkEnd w:id="38"/>
+    <w:bookmarkEnd w:id="39"/>
+    <w:bookmarkStart w:id="40" w:name="data-preprocessing"/>
     <w:p>
       <w:pPr>
         <w:pStyle w:val="Heading2"/>
@@ -1828,7 +2044,7 @@
         <w:rPr>
           <w:rStyle w:val="SectionNumber"/>
         </w:rPr>
-        <w:t xml:space="preserve">4.2</w:t>
+        <w:t xml:space="preserve">5.2</w:t>
       </w:r>
       <w:r>
         <w:tab/>
@@ -1891,8 +2107,8 @@
         <w:t xml:space="preserve">StandardScaler is applied within each cross-validation fold as part of the Pipeline (Section 4.4), fitted exclusively on the training fold.</w:t>
       </w:r>
     </w:p>
-    <w:bookmarkEnd w:id="38"/>
-    <w:bookmarkStart w:id="39" w:name="feature-selection-consensus-ranking"/>
+    <w:bookmarkEnd w:id="40"/>
+    <w:bookmarkStart w:id="41" w:name="feature-selection-consensus-ranking"/>
     <w:p>
       <w:pPr>
         <w:pStyle w:val="Heading2"/>
@@ -1901,7 +2117,7 @@
         <w:rPr>
           <w:rStyle w:val="SectionNumber"/>
         </w:rPr>
-        <w:t xml:space="preserve">4.3</w:t>
+        <w:t xml:space="preserve">5.3</w:t>
       </w:r>
       <w:r>
         <w:tab/>
@@ -2341,8 +2557,8 @@
         <w:t xml:space="preserve">is the number of feature selection methods.</w:t>
       </w:r>
     </w:p>
-    <w:bookmarkEnd w:id="39"/>
-    <w:bookmarkStart w:id="40" w:name="leak-free-pipeline-architecture"/>
+    <w:bookmarkEnd w:id="41"/>
+    <w:bookmarkStart w:id="42" w:name="leak-free-pipeline-architecture"/>
     <w:p>
       <w:pPr>
         <w:pStyle w:val="Heading2"/>
@@ -2351,7 +2567,7 @@
         <w:rPr>
           <w:rStyle w:val="SectionNumber"/>
         </w:rPr>
-        <w:t xml:space="preserve">4.4</w:t>
+        <w:t xml:space="preserve">5.4</w:t>
       </w:r>
       <w:r>
         <w:tab/>
@@ -2442,8 +2658,8 @@
         <w:t xml:space="preserve">This architecture ensures every preprocessing step observes only training data, providing an unbiased estimate of generalisation performance.</w:t>
       </w:r>
     </w:p>
-    <w:bookmarkEnd w:id="40"/>
-    <w:bookmarkStart w:id="41" w:name="proposed-classifier"/>
+    <w:bookmarkEnd w:id="42"/>
+    <w:bookmarkStart w:id="43" w:name="proposed-classifier"/>
     <w:p>
       <w:pPr>
         <w:pStyle w:val="Heading2"/>
@@ -2452,7 +2668,7 @@
         <w:rPr>
           <w:rStyle w:val="SectionNumber"/>
         </w:rPr>
-        <w:t xml:space="preserve">4.5</w:t>
+        <w:t xml:space="preserve">5.5</w:t>
       </w:r>
       <w:r>
         <w:tab/>
@@ -3302,8 +3518,8 @@
         </w:tc>
       </w:tr>
     </w:tbl>
-    <w:bookmarkEnd w:id="41"/>
-    <w:bookmarkStart w:id="42" w:name="evaluation-protocol"/>
+    <w:bookmarkEnd w:id="43"/>
+    <w:bookmarkStart w:id="44" w:name="evaluation-protocol"/>
     <w:p>
       <w:pPr>
         <w:pStyle w:val="Heading2"/>
@@ -3312,7 +3528,7 @@
         <w:rPr>
           <w:rStyle w:val="SectionNumber"/>
         </w:rPr>
-        <w:t xml:space="preserve">4.6</w:t>
+        <w:t xml:space="preserve">5.6</w:t>
       </w:r>
       <w:r>
         <w:tab/>
@@ -3950,8 +4166,8 @@
         <w:t xml:space="preserve">Average gap between confidence and accuracy across bins.</w:t>
       </w:r>
     </w:p>
-    <w:bookmarkEnd w:id="42"/>
-    <w:bookmarkStart w:id="43" w:name="X06dd9e0600acafa72a22c5cc9d813d7f3a0847f"/>
+    <w:bookmarkEnd w:id="44"/>
+    <w:bookmarkStart w:id="45" w:name="X06dd9e0600acafa72a22c5cc9d813d7f3a0847f"/>
     <w:p>
       <w:pPr>
         <w:pStyle w:val="Heading2"/>
@@ -3960,7 +4176,7 @@
         <w:rPr>
           <w:rStyle w:val="SectionNumber"/>
         </w:rPr>
-        <w:t xml:space="preserve">4.7</w:t>
+        <w:t xml:space="preserve">5.7</w:t>
       </w:r>
       <w:r>
         <w:tab/>
@@ -4115,8 +4331,8 @@
         <w:t xml:space="preserve">The wrapper is transparent to the Pipeline — it behaves exactly like any other sklearn estimator.</w:t>
       </w:r>
     </w:p>
-    <w:bookmarkEnd w:id="43"/>
-    <w:bookmarkStart w:id="44" w:name="Xcfd94f64e894a2d2d16ec7a2aae8d86058e5750"/>
+    <w:bookmarkEnd w:id="45"/>
+    <w:bookmarkStart w:id="46" w:name="Xcfd94f64e894a2d2d16ec7a2aae8d86058e5750"/>
     <w:p>
       <w:pPr>
         <w:pStyle w:val="Heading2"/>
@@ -4125,7 +4341,7 @@
         <w:rPr>
           <w:rStyle w:val="SectionNumber"/>
         </w:rPr>
-        <w:t xml:space="preserve">4.8</w:t>
+        <w:t xml:space="preserve">5.8</w:t>
       </w:r>
       <w:r>
         <w:tab/>
@@ -4329,9 +4545,9 @@
         <w:t xml:space="preserve">, weights), etc.</w:t>
       </w:r>
     </w:p>
-    <w:bookmarkEnd w:id="44"/>
-    <w:bookmarkEnd w:id="45"/>
-    <w:bookmarkStart w:id="78" w:name="results-and-analysis"/>
+    <w:bookmarkEnd w:id="46"/>
+    <w:bookmarkEnd w:id="47"/>
+    <w:bookmarkStart w:id="80" w:name="results-and-analysis"/>
     <w:p>
       <w:pPr>
         <w:pStyle w:val="Heading1"/>
@@ -4340,7 +4556,7 @@
         <w:rPr>
           <w:rStyle w:val="SectionNumber"/>
         </w:rPr>
-        <w:t xml:space="preserve">5</w:t>
+        <w:t xml:space="preserve">6</w:t>
       </w:r>
       <w:r>
         <w:tab/>
@@ -4349,7 +4565,7 @@
         <w:t xml:space="preserve">Results and Analysis</w:t>
       </w:r>
     </w:p>
-    <w:bookmarkStart w:id="55" w:name="feature-selection-consensus-ranking-1"/>
+    <w:bookmarkStart w:id="57" w:name="feature-selection-consensus-ranking-1"/>
     <w:p>
       <w:pPr>
         <w:pStyle w:val="Heading2"/>
@@ -4358,7 +4574,7 @@
         <w:rPr>
           <w:rStyle w:val="SectionNumber"/>
         </w:rPr>
-        <w:t xml:space="preserve">5.1</w:t>
+        <w:t xml:space="preserve">6.1</w:t>
       </w:r>
       <w:r>
         <w:tab/>
@@ -4367,7 +4583,7 @@
         <w:t xml:space="preserve">Feature Selection: Consensus Ranking</w:t>
       </w:r>
     </w:p>
-    <w:bookmarkStart w:id="46" w:name="primary-dataset-7-features"/>
+    <w:bookmarkStart w:id="48" w:name="primary-dataset-7-features"/>
     <w:p>
       <w:pPr>
         <w:pStyle w:val="Heading3"/>
@@ -4376,7 +4592,7 @@
         <w:rPr>
           <w:rStyle w:val="SectionNumber"/>
         </w:rPr>
-        <w:t xml:space="preserve">5.1.1</w:t>
+        <w:t xml:space="preserve">6.1.1</w:t>
       </w:r>
       <w:r>
         <w:tab/>
@@ -4766,8 +4982,8 @@
         <w:t xml:space="preserve">. The dominance of climate features over soil nutrients suggests that macro-environmental conditions are the primary driver of crop suitability.</w:t>
       </w:r>
     </w:p>
-    <w:bookmarkEnd w:id="46"/>
-    <w:bookmarkStart w:id="54" w:name="secondary-dataset-12-features"/>
+    <w:bookmarkEnd w:id="48"/>
+    <w:bookmarkStart w:id="56" w:name="secondary-dataset-12-features"/>
     <w:p>
       <w:pPr>
         <w:pStyle w:val="Heading3"/>
@@ -4776,7 +4992,7 @@
         <w:rPr>
           <w:rStyle w:val="SectionNumber"/>
         </w:rPr>
-        <w:t xml:space="preserve">5.1.2</w:t>
+        <w:t xml:space="preserve">6.1.2</w:t>
       </w:r>
       <w:r>
         <w:tab/>
@@ -5327,7 +5543,7 @@
         <w:t xml:space="preserve">dominate — contrary to the primary dataset where macronutrients (N, P, K) are mid-ranked.</w:t>
       </w:r>
     </w:p>
-    <w:bookmarkStart w:id="49" w:name="fig:primary_dist"/>
+    <w:bookmarkStart w:id="51" w:name="fig:primary_dist"/>
     <w:p>
       <w:pPr>
         <w:pStyle w:val="CaptionedFigure"/>
@@ -5337,18 +5553,18 @@
           <wp:inline>
             <wp:extent cx="5334000" cy="2642293"/>
             <wp:effectExtent b="0" l="0" r="0" t="0"/>
-            <wp:docPr descr="Feature distributions of the primary (semi-synthetic) crop recommendation dataset." title="" id="47" name="Picture"/>
+            <wp:docPr descr="Feature distributions of the primary (semi-synthetic) crop recommendation dataset." title="" id="49" name="Picture"/>
             <a:graphic>
               <a:graphicData uri="http://schemas.openxmlformats.org/drawingml/2006/picture">
                 <pic:pic>
                   <pic:nvPicPr>
-                    <pic:cNvPr descr="01_primary_distributions.png" id="48" name="Picture"/>
+                    <pic:cNvPr descr="01_primary_distributions.png" id="50" name="Picture"/>
                     <pic:cNvPicPr>
                       <a:picLocks noChangeArrowheads="1" noChangeAspect="1"/>
                     </pic:cNvPicPr>
                   </pic:nvPicPr>
                   <pic:blipFill>
-                    <a:blip r:embed="rId33"/>
+                    <a:blip r:embed="rId35"/>
                     <a:stretch>
                       <a:fillRect/>
                     </a:stretch>
@@ -5383,8 +5599,8 @@
         <w:t xml:space="preserve">Feature distributions of the primary (semi-synthetic) crop recommendation dataset.</w:t>
       </w:r>
     </w:p>
-    <w:bookmarkEnd w:id="49"/>
-    <w:bookmarkStart w:id="53" w:name="fig:secondary_dist"/>
+    <w:bookmarkEnd w:id="51"/>
+    <w:bookmarkStart w:id="55" w:name="fig:secondary_dist"/>
     <w:p>
       <w:pPr>
         <w:pStyle w:val="CaptionedFigure"/>
@@ -5394,18 +5610,18 @@
           <wp:inline>
             <wp:extent cx="5334000" cy="3359351"/>
             <wp:effectExtent b="0" l="0" r="0" t="0"/>
-            <wp:docPr descr="Feature distributions of the secondary (real) soil fertility dataset." title="" id="51" name="Picture"/>
+            <wp:docPr descr="Feature distributions of the secondary (real) soil fertility dataset." title="" id="53" name="Picture"/>
             <a:graphic>
               <a:graphicData uri="http://schemas.openxmlformats.org/drawingml/2006/picture">
                 <pic:pic>
                   <pic:nvPicPr>
-                    <pic:cNvPr descr="02_secondary_distributions.png" id="52" name="Picture"/>
+                    <pic:cNvPr descr="02_secondary_distributions.png" id="54" name="Picture"/>
                     <pic:cNvPicPr>
                       <a:picLocks noChangeArrowheads="1" noChangeAspect="1"/>
                     </pic:cNvPicPr>
                   </pic:nvPicPr>
                   <pic:blipFill>
-                    <a:blip r:embed="rId50"/>
+                    <a:blip r:embed="rId52"/>
                     <a:stretch>
                       <a:fillRect/>
                     </a:stretch>
@@ -5440,10 +5656,10 @@
         <w:t xml:space="preserve">Feature distributions of the secondary (real) soil fertility dataset.</w:t>
       </w:r>
     </w:p>
-    <w:bookmarkEnd w:id="53"/>
-    <w:bookmarkEnd w:id="54"/>
     <w:bookmarkEnd w:id="55"/>
-    <w:bookmarkStart w:id="60" w:name="X7a20b1ee25f83f865335e43a6614171b74aba36"/>
+    <w:bookmarkEnd w:id="56"/>
+    <w:bookmarkEnd w:id="57"/>
+    <w:bookmarkStart w:id="62" w:name="X7a20b1ee25f83f865335e43a6614171b74aba36"/>
     <w:p>
       <w:pPr>
         <w:pStyle w:val="Heading2"/>
@@ -5452,7 +5668,7 @@
         <w:rPr>
           <w:rStyle w:val="SectionNumber"/>
         </w:rPr>
-        <w:t xml:space="preserve">5.2</w:t>
+        <w:t xml:space="preserve">6.2</w:t>
       </w:r>
       <w:r>
         <w:tab/>
@@ -6507,7 +6723,7 @@
         </w:tc>
       </w:tr>
     </w:tbl>
-    <w:bookmarkStart w:id="59" w:name="fig:cv"/>
+    <w:bookmarkStart w:id="61" w:name="fig:cv"/>
     <w:p>
       <w:pPr>
         <w:pStyle w:val="CaptionedFigure"/>
@@ -6517,18 +6733,18 @@
           <wp:inline>
             <wp:extent cx="5334000" cy="2114014"/>
             <wp:effectExtent b="0" l="0" r="0" t="0"/>
-            <wp:docPr descr="Cross-validation comparison across classifiers on both datasets." title="" id="57" name="Picture"/>
+            <wp:docPr descr="Cross-validation comparison across classifiers on both datasets." title="" id="59" name="Picture"/>
             <a:graphic>
               <a:graphicData uri="http://schemas.openxmlformats.org/drawingml/2006/picture">
                 <pic:pic>
                   <pic:nvPicPr>
-                    <pic:cNvPr descr="10_cv_comparison.png" id="58" name="Picture"/>
+                    <pic:cNvPr descr="10_cv_comparison.png" id="60" name="Picture"/>
                     <pic:cNvPicPr>
                       <a:picLocks noChangeArrowheads="1" noChangeAspect="1"/>
                     </pic:cNvPicPr>
                   </pic:nvPicPr>
                   <pic:blipFill>
-                    <a:blip r:embed="rId56"/>
+                    <a:blip r:embed="rId58"/>
                     <a:stretch>
                       <a:fillRect/>
                     </a:stretch>
@@ -6563,9 +6779,9 @@
         <w:t xml:space="preserve">Cross-validation comparison across classifiers on both datasets.</w:t>
       </w:r>
     </w:p>
-    <w:bookmarkEnd w:id="59"/>
-    <w:bookmarkEnd w:id="60"/>
-    <w:bookmarkStart w:id="61" w:name="X851d27663a7538d7f766c6bc4e2b2cb44b81e95"/>
+    <w:bookmarkEnd w:id="61"/>
+    <w:bookmarkEnd w:id="62"/>
+    <w:bookmarkStart w:id="63" w:name="X851d27663a7538d7f766c6bc4e2b2cb44b81e95"/>
     <w:p>
       <w:pPr>
         <w:pStyle w:val="Heading2"/>
@@ -6574,7 +6790,7 @@
         <w:rPr>
           <w:rStyle w:val="SectionNumber"/>
         </w:rPr>
-        <w:t xml:space="preserve">5.3</w:t>
+        <w:t xml:space="preserve">6.3</w:t>
       </w:r>
       <w:r>
         <w:tab/>
@@ -7710,8 +7926,8 @@
         <w:t xml:space="preserve">applied, LightGBM achieves 90.34% — competitive with XGBoost.</w:t>
       </w:r>
     </w:p>
-    <w:bookmarkEnd w:id="61"/>
-    <w:bookmarkStart w:id="62" w:name="feature-subset-ablation"/>
+    <w:bookmarkEnd w:id="63"/>
+    <w:bookmarkStart w:id="64" w:name="feature-subset-ablation"/>
     <w:p>
       <w:pPr>
         <w:pStyle w:val="Heading2"/>
@@ -7720,7 +7936,7 @@
         <w:rPr>
           <w:rStyle w:val="SectionNumber"/>
         </w:rPr>
-        <w:t xml:space="preserve">5.4</w:t>
+        <w:t xml:space="preserve">6.4</w:t>
       </w:r>
       <w:r>
         <w:tab/>
@@ -8039,8 +8255,8 @@
         <w:t xml:space="preserve">with minimal accuracy loss.</w:t>
       </w:r>
     </w:p>
-    <w:bookmarkEnd w:id="62"/>
-    <w:bookmarkStart w:id="67" w:name="sensor-degradation-robustness"/>
+    <w:bookmarkEnd w:id="64"/>
+    <w:bookmarkStart w:id="69" w:name="sensor-degradation-robustness"/>
     <w:p>
       <w:pPr>
         <w:pStyle w:val="Heading2"/>
@@ -8049,7 +8265,7 @@
         <w:rPr>
           <w:rStyle w:val="SectionNumber"/>
         </w:rPr>
-        <w:t xml:space="preserve">5.5</w:t>
+        <w:t xml:space="preserve">6.5</w:t>
       </w:r>
       <w:r>
         <w:tab/>
@@ -8511,7 +8727,7 @@
         <w:t xml:space="preserve">for deployment reliability.</w:t>
       </w:r>
     </w:p>
-    <w:bookmarkStart w:id="66" w:name="fig:robustness"/>
+    <w:bookmarkStart w:id="68" w:name="fig:robustness"/>
     <w:p>
       <w:pPr>
         <w:pStyle w:val="CaptionedFigure"/>
@@ -8521,18 +8737,18 @@
           <wp:inline>
             <wp:extent cx="5334000" cy="1766789"/>
             <wp:effectExtent b="0" l="0" r="0" t="0"/>
-            <wp:docPr descr="Sensor degradation robustness: accuracy under mild (7-day), moderate (30-day), and severe (90-day) monotonic drift." title="" id="64" name="Picture"/>
+            <wp:docPr descr="Sensor degradation robustness: accuracy under mild (7-day), moderate (30-day), and severe (90-day) monotonic drift." title="" id="66" name="Picture"/>
             <a:graphic>
               <a:graphicData uri="http://schemas.openxmlformats.org/drawingml/2006/picture">
                 <pic:pic>
                   <pic:nvPicPr>
-                    <pic:cNvPr descr="12_robustness.png" id="65" name="Picture"/>
+                    <pic:cNvPr descr="12_robustness.png" id="67" name="Picture"/>
                     <pic:cNvPicPr>
                       <a:picLocks noChangeArrowheads="1" noChangeAspect="1"/>
                     </pic:cNvPicPr>
                   </pic:nvPicPr>
                   <pic:blipFill>
-                    <a:blip r:embed="rId63"/>
+                    <a:blip r:embed="rId65"/>
                     <a:stretch>
                       <a:fillRect/>
                     </a:stretch>
@@ -8567,9 +8783,9 @@
         <w:t xml:space="preserve">Sensor degradation robustness: accuracy under mild (7-day), moderate (30-day), and severe (90-day) monotonic drift.</w:t>
       </w:r>
     </w:p>
-    <w:bookmarkEnd w:id="66"/>
-    <w:bookmarkEnd w:id="67"/>
-    <w:bookmarkStart w:id="72" w:name="shap-explainability-analysis"/>
+    <w:bookmarkEnd w:id="68"/>
+    <w:bookmarkEnd w:id="69"/>
+    <w:bookmarkStart w:id="74" w:name="shap-explainability-analysis"/>
     <w:p>
       <w:pPr>
         <w:pStyle w:val="Heading2"/>
@@ -8578,7 +8794,7 @@
         <w:rPr>
           <w:rStyle w:val="SectionNumber"/>
         </w:rPr>
-        <w:t xml:space="preserve">5.6</w:t>
+        <w:t xml:space="preserve">6.6</w:t>
       </w:r>
       <w:r>
         <w:tab/>
@@ -9053,7 +9269,7 @@
         <w:t xml:space="preserve">.</w:t>
       </w:r>
     </w:p>
-    <w:bookmarkStart w:id="71" w:name="fig:shap"/>
+    <w:bookmarkStart w:id="73" w:name="fig:shap"/>
     <w:p>
       <w:pPr>
         <w:pStyle w:val="CaptionedFigure"/>
@@ -9063,18 +9279,18 @@
           <wp:inline>
             <wp:extent cx="5334000" cy="3148529"/>
             <wp:effectExtent b="0" l="0" r="0" t="0"/>
-            <wp:docPr descr="SHAP feature importance for the Random Forest classifier on the primary dataset." title="" id="69" name="Picture"/>
+            <wp:docPr descr="SHAP feature importance for the Random Forest classifier on the primary dataset." title="" id="71" name="Picture"/>
             <a:graphic>
               <a:graphicData uri="http://schemas.openxmlformats.org/drawingml/2006/picture">
                 <pic:pic>
                   <pic:nvPicPr>
-                    <pic:cNvPr descr="11_shap_RandomForest.png" id="70" name="Picture"/>
+                    <pic:cNvPr descr="11_shap_RandomForest.png" id="72" name="Picture"/>
                     <pic:cNvPicPr>
                       <a:picLocks noChangeArrowheads="1" noChangeAspect="1"/>
                     </pic:cNvPicPr>
                   </pic:nvPicPr>
                   <pic:blipFill>
-                    <a:blip r:embed="rId68"/>
+                    <a:blip r:embed="rId70"/>
                     <a:stretch>
                       <a:fillRect/>
                     </a:stretch>
@@ -9109,9 +9325,9 @@
         <w:t xml:space="preserve">SHAP feature importance for the Random Forest classifier on the primary dataset.</w:t>
       </w:r>
     </w:p>
-    <w:bookmarkEnd w:id="71"/>
-    <w:bookmarkEnd w:id="72"/>
-    <w:bookmarkStart w:id="77" w:name="cross-dataset-feature-consistency"/>
+    <w:bookmarkEnd w:id="73"/>
+    <w:bookmarkEnd w:id="74"/>
+    <w:bookmarkStart w:id="79" w:name="cross-dataset-feature-consistency"/>
     <w:p>
       <w:pPr>
         <w:pStyle w:val="Heading2"/>
@@ -9120,7 +9336,7 @@
         <w:rPr>
           <w:rStyle w:val="SectionNumber"/>
         </w:rPr>
-        <w:t xml:space="preserve">5.7</w:t>
+        <w:t xml:space="preserve">6.7</w:t>
       </w:r>
       <w:r>
         <w:tab/>
@@ -9627,7 +9843,7 @@
         <w:t xml:space="preserve">(0.293). This divergence underscores that feature importance should not be generalised from a single dataset.</w:t>
       </w:r>
     </w:p>
-    <w:bookmarkStart w:id="76" w:name="fig:cross_dataset"/>
+    <w:bookmarkStart w:id="78" w:name="fig:cross_dataset"/>
     <w:p>
       <w:pPr>
         <w:pStyle w:val="CaptionedFigure"/>
@@ -9637,18 +9853,18 @@
           <wp:inline>
             <wp:extent cx="5334000" cy="3789201"/>
             <wp:effectExtent b="0" l="0" r="0" t="0"/>
-            <wp:docPr descr="Cross-dataset feature comparison for shared features (N, P, K)." title="" id="74" name="Picture"/>
+            <wp:docPr descr="Cross-dataset feature comparison for shared features (N, P, K)." title="" id="76" name="Picture"/>
             <a:graphic>
               <a:graphicData uri="http://schemas.openxmlformats.org/drawingml/2006/picture">
                 <pic:pic>
                   <pic:nvPicPr>
-                    <pic:cNvPr descr="07_shared_features_comparison.png" id="75" name="Picture"/>
+                    <pic:cNvPr descr="07_shared_features_comparison.png" id="77" name="Picture"/>
                     <pic:cNvPicPr>
                       <a:picLocks noChangeArrowheads="1" noChangeAspect="1"/>
                     </pic:cNvPicPr>
                   </pic:nvPicPr>
                   <pic:blipFill>
-                    <a:blip r:embed="rId73"/>
+                    <a:blip r:embed="rId75"/>
                     <a:stretch>
                       <a:fillRect/>
                     </a:stretch>
@@ -9683,10 +9899,10 @@
         <w:t xml:space="preserve">Cross-dataset feature comparison for shared features (N, P, K).</w:t>
       </w:r>
     </w:p>
-    <w:bookmarkEnd w:id="76"/>
-    <w:bookmarkEnd w:id="77"/>
     <w:bookmarkEnd w:id="78"/>
-    <w:bookmarkStart w:id="88" w:name="discussion"/>
+    <w:bookmarkEnd w:id="79"/>
+    <w:bookmarkEnd w:id="80"/>
+    <w:bookmarkStart w:id="90" w:name="discussion"/>
     <w:p>
       <w:pPr>
         <w:pStyle w:val="Heading1"/>
@@ -9695,7 +9911,7 @@
         <w:rPr>
           <w:rStyle w:val="SectionNumber"/>
         </w:rPr>
-        <w:t xml:space="preserve">6</w:t>
+        <w:t xml:space="preserve">7</w:t>
       </w:r>
       <w:r>
         <w:tab/>
@@ -9704,7 +9920,7 @@
         <w:t xml:space="preserve">Discussion</w:t>
       </w:r>
     </w:p>
-    <w:bookmarkStart w:id="79" w:name="X91134634362f01e25bf5899beecbff910f774b4"/>
+    <w:bookmarkStart w:id="81" w:name="X91134634362f01e25bf5899beecbff910f774b4"/>
     <w:p>
       <w:pPr>
         <w:pStyle w:val="Heading2"/>
@@ -9713,7 +9929,7 @@
         <w:rPr>
           <w:rStyle w:val="SectionNumber"/>
         </w:rPr>
-        <w:t xml:space="preserve">6.1</w:t>
+        <w:t xml:space="preserve">7.1</w:t>
       </w:r>
       <w:r>
         <w:tab/>
@@ -9804,8 +10020,8 @@
         <w:t xml:space="preserve">RF’s random feature subsampling decorrelates trees and reduces overfitting to the majority class’s feature distribution.</w:t>
       </w:r>
     </w:p>
-    <w:bookmarkEnd w:id="79"/>
-    <w:bookmarkStart w:id="84" w:name="calibration-and-decision-reliability"/>
+    <w:bookmarkEnd w:id="81"/>
+    <w:bookmarkStart w:id="86" w:name="calibration-and-decision-reliability"/>
     <w:p>
       <w:pPr>
         <w:pStyle w:val="Heading2"/>
@@ -9814,7 +10030,7 @@
         <w:rPr>
           <w:rStyle w:val="SectionNumber"/>
         </w:rPr>
-        <w:t xml:space="preserve">6.2</w:t>
+        <w:t xml:space="preserve">7.2</w:t>
       </w:r>
       <w:r>
         <w:tab/>
@@ -9831,7 +10047,7 @@
         <w:t xml:space="preserve">For agricultural deployment, classification accuracy alone is insufficient. Our calibration analysis reveals that Random Forest is moderately well-calibrated (ECE = 0.0430) but tends toward overconfidence. LightGBM achieves the best calibration (ECE = 0.0068), making it preferred when probability estimates are critical. GaussianNB is poorly calibrated despite high accuracy, producing near-0/1 posteriors.</w:t>
       </w:r>
     </w:p>
-    <w:bookmarkStart w:id="83" w:name="fig:calibration"/>
+    <w:bookmarkStart w:id="85" w:name="fig:calibration"/>
     <w:p>
       <w:pPr>
         <w:pStyle w:val="CaptionedFigure"/>
@@ -9841,18 +10057,18 @@
           <wp:inline>
             <wp:extent cx="5334000" cy="1467174"/>
             <wp:effectExtent b="0" l="0" r="0" t="0"/>
-            <wp:docPr descr="Calibration curves for the proposed Random Forest classifier." title="" id="81" name="Picture"/>
+            <wp:docPr descr="Calibration curves for the proposed Random Forest classifier." title="" id="83" name="Picture"/>
             <a:graphic>
               <a:graphicData uri="http://schemas.openxmlformats.org/drawingml/2006/picture">
                 <pic:pic>
                   <pic:nvPicPr>
-                    <pic:cNvPr descr="13_calibration.png" id="82" name="Picture"/>
+                    <pic:cNvPr descr="13_calibration.png" id="84" name="Picture"/>
                     <pic:cNvPicPr>
                       <a:picLocks noChangeArrowheads="1" noChangeAspect="1"/>
                     </pic:cNvPicPr>
                   </pic:nvPicPr>
                   <pic:blipFill>
-                    <a:blip r:embed="rId80"/>
+                    <a:blip r:embed="rId82"/>
                     <a:stretch>
                       <a:fillRect/>
                     </a:stretch>
@@ -9887,9 +10103,9 @@
         <w:t xml:space="preserve">Calibration curves for the proposed Random Forest classifier.</w:t>
       </w:r>
     </w:p>
-    <w:bookmarkEnd w:id="83"/>
-    <w:bookmarkEnd w:id="84"/>
-    <w:bookmarkStart w:id="85" w:name="practical-deployment-guidance"/>
+    <w:bookmarkEnd w:id="85"/>
+    <w:bookmarkEnd w:id="86"/>
+    <w:bookmarkStart w:id="87" w:name="practical-deployment-guidance"/>
     <w:p>
       <w:pPr>
         <w:pStyle w:val="Heading2"/>
@@ -9898,7 +10114,7 @@
         <w:rPr>
           <w:rStyle w:val="SectionNumber"/>
         </w:rPr>
-        <w:t xml:space="preserve">6.3</w:t>
+        <w:t xml:space="preserve">7.3</w:t>
       </w:r>
       <w:r>
         <w:tab/>
@@ -10205,8 +10421,8 @@
         </w:tc>
       </w:tr>
     </w:tbl>
-    <w:bookmarkEnd w:id="85"/>
-    <w:bookmarkStart w:id="86" w:name="limitations"/>
+    <w:bookmarkEnd w:id="87"/>
+    <w:bookmarkStart w:id="88" w:name="limitations"/>
     <w:p>
       <w:pPr>
         <w:pStyle w:val="Heading2"/>
@@ -10215,7 +10431,7 @@
         <w:rPr>
           <w:rStyle w:val="SectionNumber"/>
         </w:rPr>
-        <w:t xml:space="preserve">6.4</w:t>
+        <w:t xml:space="preserve">7.4</w:t>
       </w:r>
       <w:r>
         <w:tab/>
@@ -10312,8 +10528,8 @@
         <w:t xml:space="preserve">Current analysis provides global feature importance. Per-class SHAP breakdowns would provide deeper agronomic insight.</w:t>
       </w:r>
     </w:p>
-    <w:bookmarkEnd w:id="86"/>
-    <w:bookmarkStart w:id="87" w:name="future-work"/>
+    <w:bookmarkEnd w:id="88"/>
+    <w:bookmarkStart w:id="89" w:name="future-work"/>
     <w:p>
       <w:pPr>
         <w:pStyle w:val="Heading2"/>
@@ -10322,7 +10538,7 @@
         <w:rPr>
           <w:rStyle w:val="SectionNumber"/>
         </w:rPr>
-        <w:t xml:space="preserve">6.5</w:t>
+        <w:t xml:space="preserve">7.5</w:t>
       </w:r>
       <w:r>
         <w:tab/>
@@ -10391,9 +10607,9 @@
         <w:t xml:space="preserve">Per-class SHAP analysis for misclassified samples to identify agronomic edge cases.</w:t>
       </w:r>
     </w:p>
-    <w:bookmarkEnd w:id="87"/>
-    <w:bookmarkEnd w:id="88"/>
-    <w:bookmarkStart w:id="89" w:name="conclusion"/>
+    <w:bookmarkEnd w:id="89"/>
+    <w:bookmarkEnd w:id="90"/>
+    <w:bookmarkStart w:id="91" w:name="conclusion"/>
     <w:p>
       <w:pPr>
         <w:pStyle w:val="Heading1"/>
@@ -10402,7 +10618,7 @@
         <w:rPr>
           <w:rStyle w:val="SectionNumber"/>
         </w:rPr>
-        <w:t xml:space="preserve">7</w:t>
+        <w:t xml:space="preserve">8</w:t>
       </w:r>
       <w:r>
         <w:tab/>
@@ -10693,8 +10909,8 @@
         <w:t xml:space="preserve">These findings provide actionable guidance for deploying ML-based crop recommendation in precision agriculture, from sensor selection and feature engineering to classifier choice and maintenance scheduling.</w:t>
       </w:r>
     </w:p>
-    <w:bookmarkEnd w:id="89"/>
-    <w:bookmarkStart w:id="120" w:name="references"/>
+    <w:bookmarkEnd w:id="91"/>
+    <w:bookmarkStart w:id="122" w:name="references"/>
     <w:p>
       <w:pPr>
         <w:pStyle w:val="Heading1"/>
@@ -10703,8 +10919,8 @@
         <w:t xml:space="preserve">References</w:t>
       </w:r>
     </w:p>
-    <w:bookmarkStart w:id="119" w:name="refs"/>
-    <w:bookmarkStart w:id="91" w:name="ref-WorldBank2023"/>
+    <w:bookmarkStart w:id="121" w:name="refs"/>
+    <w:bookmarkStart w:id="93" w:name="ref-WorldBank2023"/>
     <w:p>
       <w:pPr>
         <w:pStyle w:val="Bibliography"/>
@@ -10736,7 +10952,7 @@
       <w:r>
         <w:t xml:space="preserve"> </w:t>
       </w:r>
-      <w:hyperlink r:id="rId90">
+      <w:hyperlink r:id="rId92">
         <w:r>
           <w:rPr>
             <w:rStyle w:val="Hyperlink"/>
@@ -10745,8 +10961,8 @@
         </w:r>
       </w:hyperlink>
     </w:p>
-    <w:bookmarkEnd w:id="91"/>
-    <w:bookmarkStart w:id="93" w:name="ref-Kapoor2023"/>
+    <w:bookmarkEnd w:id="93"/>
+    <w:bookmarkStart w:id="95" w:name="ref-Kapoor2023"/>
     <w:p>
       <w:pPr>
         <w:pStyle w:val="Bibliography"/>
@@ -10785,7 +11001,7 @@
       <w:r>
         <w:t xml:space="preserve"> </w:t>
       </w:r>
-      <w:hyperlink r:id="rId92">
+      <w:hyperlink r:id="rId94">
         <w:r>
           <w:rPr>
             <w:rStyle w:val="Hyperlink"/>
@@ -10797,8 +11013,8 @@
         <w:t xml:space="preserve">.</w:t>
       </w:r>
     </w:p>
-    <w:bookmarkEnd w:id="93"/>
-    <w:bookmarkStart w:id="95" w:name="ref-Liakos2018"/>
+    <w:bookmarkEnd w:id="95"/>
+    <w:bookmarkStart w:id="97" w:name="ref-Liakos2018"/>
     <w:p>
       <w:pPr>
         <w:pStyle w:val="Bibliography"/>
@@ -10837,7 +11053,7 @@
       <w:r>
         <w:t xml:space="preserve"> </w:t>
       </w:r>
-      <w:hyperlink r:id="rId94">
+      <w:hyperlink r:id="rId96">
         <w:r>
           <w:rPr>
             <w:rStyle w:val="Hyperlink"/>
@@ -10849,8 +11065,8 @@
         <w:t xml:space="preserve">.</w:t>
       </w:r>
     </w:p>
-    <w:bookmarkEnd w:id="95"/>
-    <w:bookmarkStart w:id="97" w:name="ref-Shah2022"/>
+    <w:bookmarkEnd w:id="97"/>
+    <w:bookmarkStart w:id="99" w:name="ref-Shah2022"/>
     <w:p>
       <w:pPr>
         <w:pStyle w:val="Bibliography"/>
@@ -10889,7 +11105,7 @@
       <w:r>
         <w:t xml:space="preserve"> </w:t>
       </w:r>
-      <w:hyperlink r:id="rId96">
+      <w:hyperlink r:id="rId98">
         <w:r>
           <w:rPr>
             <w:rStyle w:val="Hyperlink"/>
@@ -10901,8 +11117,8 @@
         <w:t xml:space="preserve">.</w:t>
       </w:r>
     </w:p>
-    <w:bookmarkEnd w:id="97"/>
-    <w:bookmarkStart w:id="99" w:name="ref-Kamilaris2018"/>
+    <w:bookmarkEnd w:id="99"/>
+    <w:bookmarkStart w:id="101" w:name="ref-Kamilaris2018"/>
     <w:p>
       <w:pPr>
         <w:pStyle w:val="Bibliography"/>
@@ -10941,7 +11157,7 @@
       <w:r>
         <w:t xml:space="preserve"> </w:t>
       </w:r>
-      <w:hyperlink r:id="rId98">
+      <w:hyperlink r:id="rId100">
         <w:r>
           <w:rPr>
             <w:rStyle w:val="Hyperlink"/>
@@ -10953,8 +11169,8 @@
         <w:t xml:space="preserve">.</w:t>
       </w:r>
     </w:p>
-    <w:bookmarkEnd w:id="99"/>
-    <w:bookmarkStart w:id="100" w:name="ref-Guyon2003"/>
+    <w:bookmarkEnd w:id="101"/>
+    <w:bookmarkStart w:id="102" w:name="ref-Guyon2003"/>
     <w:p>
       <w:pPr>
         <w:pStyle w:val="Bibliography"/>
@@ -10991,8 +11207,8 @@
         <w:t xml:space="preserve">, vol. 3, pp. 1157–1182, 2003.</w:t>
       </w:r>
     </w:p>
-    <w:bookmarkEnd w:id="100"/>
-    <w:bookmarkStart w:id="102" w:name="ref-Chandrashekar2014"/>
+    <w:bookmarkEnd w:id="102"/>
+    <w:bookmarkStart w:id="104" w:name="ref-Chandrashekar2014"/>
     <w:p>
       <w:pPr>
         <w:pStyle w:val="Bibliography"/>
@@ -11031,7 +11247,7 @@
       <w:r>
         <w:t xml:space="preserve"> </w:t>
       </w:r>
-      <w:hyperlink r:id="rId101">
+      <w:hyperlink r:id="rId103">
         <w:r>
           <w:rPr>
             <w:rStyle w:val="Hyperlink"/>
@@ -11043,8 +11259,8 @@
         <w:t xml:space="preserve">.</w:t>
       </w:r>
     </w:p>
-    <w:bookmarkEnd w:id="102"/>
-    <w:bookmarkStart w:id="104" w:name="ref-Wolfert2017"/>
+    <w:bookmarkEnd w:id="104"/>
+    <w:bookmarkStart w:id="106" w:name="ref-Wolfert2017"/>
     <w:p>
       <w:pPr>
         <w:pStyle w:val="Bibliography"/>
@@ -11083,7 +11299,7 @@
       <w:r>
         <w:t xml:space="preserve"> </w:t>
       </w:r>
-      <w:hyperlink r:id="rId103">
+      <w:hyperlink r:id="rId105">
         <w:r>
           <w:rPr>
             <w:rStyle w:val="Hyperlink"/>
@@ -11095,8 +11311,8 @@
         <w:t xml:space="preserve">.</w:t>
       </w:r>
     </w:p>
-    <w:bookmarkEnd w:id="104"/>
-    <w:bookmarkStart w:id="106" w:name="ref-Rana2019"/>
+    <w:bookmarkEnd w:id="106"/>
+    <w:bookmarkStart w:id="108" w:name="ref-Rana2019"/>
     <w:p>
       <w:pPr>
         <w:pStyle w:val="Bibliography"/>
@@ -11135,7 +11351,7 @@
       <w:r>
         <w:t xml:space="preserve"> </w:t>
       </w:r>
-      <w:hyperlink r:id="rId105">
+      <w:hyperlink r:id="rId107">
         <w:r>
           <w:rPr>
             <w:rStyle w:val="Hyperlink"/>
@@ -11147,8 +11363,8 @@
         <w:t xml:space="preserve">.</w:t>
       </w:r>
     </w:p>
-    <w:bookmarkEnd w:id="106"/>
-    <w:bookmarkStart w:id="108" w:name="ref-Lobnik2011"/>
+    <w:bookmarkEnd w:id="108"/>
+    <w:bookmarkStart w:id="110" w:name="ref-Lobnik2011"/>
     <w:p>
       <w:pPr>
         <w:pStyle w:val="Bibliography"/>
@@ -11187,7 +11403,7 @@
       <w:r>
         <w:t xml:space="preserve"> </w:t>
       </w:r>
-      <w:hyperlink r:id="rId107">
+      <w:hyperlink r:id="rId109">
         <w:r>
           <w:rPr>
             <w:rStyle w:val="Hyperlink"/>
@@ -11199,8 +11415,8 @@
         <w:t xml:space="preserve">.</w:t>
       </w:r>
     </w:p>
-    <w:bookmarkEnd w:id="108"/>
-    <w:bookmarkStart w:id="109" w:name="ref-Pedregosa2011"/>
+    <w:bookmarkEnd w:id="110"/>
+    <w:bookmarkStart w:id="111" w:name="ref-Pedregosa2011"/>
     <w:p>
       <w:pPr>
         <w:pStyle w:val="Bibliography"/>
@@ -11250,8 +11466,8 @@
         <w:t xml:space="preserve">, vol. 12, pp. 2825–2830, 2011.</w:t>
       </w:r>
     </w:p>
-    <w:bookmarkEnd w:id="109"/>
-    <w:bookmarkStart w:id="111" w:name="ref-Breiman2001"/>
+    <w:bookmarkEnd w:id="111"/>
+    <w:bookmarkStart w:id="113" w:name="ref-Breiman2001"/>
     <w:p>
       <w:pPr>
         <w:pStyle w:val="Bibliography"/>
@@ -11290,7 +11506,7 @@
       <w:r>
         <w:t xml:space="preserve"> </w:t>
       </w:r>
-      <w:hyperlink r:id="rId110">
+      <w:hyperlink r:id="rId112">
         <w:r>
           <w:rPr>
             <w:rStyle w:val="Hyperlink"/>
@@ -11302,8 +11518,8 @@
         <w:t xml:space="preserve">.</w:t>
       </w:r>
     </w:p>
-    <w:bookmarkEnd w:id="111"/>
-    <w:bookmarkStart w:id="112" w:name="ref-Kohavi1995"/>
+    <w:bookmarkEnd w:id="113"/>
+    <w:bookmarkStart w:id="114" w:name="ref-Kohavi1995"/>
     <w:p>
       <w:pPr>
         <w:pStyle w:val="Bibliography"/>
@@ -11346,8 +11562,8 @@
         <w:t xml:space="preserve">, 1995, pp. 1137–1143.</w:t>
       </w:r>
     </w:p>
-    <w:bookmarkEnd w:id="112"/>
-    <w:bookmarkStart w:id="114" w:name="ref-Friedman1937"/>
+    <w:bookmarkEnd w:id="114"/>
+    <w:bookmarkStart w:id="116" w:name="ref-Friedman1937"/>
     <w:p>
       <w:pPr>
         <w:pStyle w:val="Bibliography"/>
@@ -11386,7 +11602,7 @@
       <w:r>
         <w:t xml:space="preserve"> </w:t>
       </w:r>
-      <w:hyperlink r:id="rId113">
+      <w:hyperlink r:id="rId115">
         <w:r>
           <w:rPr>
             <w:rStyle w:val="Hyperlink"/>
@@ -11398,8 +11614,8 @@
         <w:t xml:space="preserve">.</w:t>
       </w:r>
     </w:p>
-    <w:bookmarkEnd w:id="114"/>
-    <w:bookmarkStart w:id="115" w:name="ref-Guo2017"/>
+    <w:bookmarkEnd w:id="116"/>
+    <w:bookmarkStart w:id="117" w:name="ref-Guo2017"/>
     <w:p>
       <w:pPr>
         <w:pStyle w:val="Bibliography"/>
@@ -11442,8 +11658,8 @@
         <w:t xml:space="preserve">, 2017, pp. 1321–1330.</w:t>
       </w:r>
     </w:p>
-    <w:bookmarkEnd w:id="115"/>
-    <w:bookmarkStart w:id="117" w:name="ref-Akiba2019"/>
+    <w:bookmarkEnd w:id="117"/>
+    <w:bookmarkStart w:id="119" w:name="ref-Akiba2019"/>
     <w:p>
       <w:pPr>
         <w:pStyle w:val="Bibliography"/>
@@ -11488,7 +11704,7 @@
       <w:r>
         <w:t xml:space="preserve"> </w:t>
       </w:r>
-      <w:hyperlink r:id="rId116">
+      <w:hyperlink r:id="rId118">
         <w:r>
           <w:rPr>
             <w:rStyle w:val="Hyperlink"/>
@@ -11500,8 +11716,8 @@
         <w:t xml:space="preserve">.</w:t>
       </w:r>
     </w:p>
-    <w:bookmarkEnd w:id="117"/>
-    <w:bookmarkStart w:id="118" w:name="ref-Lundberg2017"/>
+    <w:bookmarkEnd w:id="119"/>
+    <w:bookmarkStart w:id="120" w:name="ref-Lundberg2017"/>
     <w:p>
       <w:pPr>
         <w:pStyle w:val="Bibliography"/>
@@ -11544,9 +11760,9 @@
         <w:t xml:space="preserve">, 2017.</w:t>
       </w:r>
     </w:p>
-    <w:bookmarkEnd w:id="118"/>
-    <w:bookmarkEnd w:id="119"/>
     <w:bookmarkEnd w:id="120"/>
+    <w:bookmarkEnd w:id="121"/>
+    <w:bookmarkEnd w:id="122"/>
     <w:sectPr>
       <w:footnotePr>
         <w:numRestart w:val="eachSect"/>

</xml_diff>

<commit_message>
Fix figures: remove duplicates, add all 15 figures in correct sections
- Removed duplicate: 01_primary_distributions.png was used twice
  (once as 'architecture' and once as actual distributions)
- Added missing figures: correlation heatmaps (03, 04), class
  distributions (05), degradation comparison (06), feature selection
  (08, 09), SHAP GaussianNB (11), per-class heatmap (14)
- All 15 figures now appear exactly once in appropriate sections
</commit_message>
<xml_diff>
--- a/RobustCrop_Paper.docx
+++ b/RobustCrop_Paper.docx
@@ -1977,7 +1977,7 @@
         <w:t xml:space="preserve">. The system architecture is illustrated in Figure 1.</w:t>
       </w:r>
     </w:p>
-    <w:bookmarkStart w:id="38" w:name="fig:arch"/>
+    <w:bookmarkStart w:id="38" w:name="fig:primary_corr"/>
     <w:p>
       <w:pPr>
         <w:pStyle w:val="CaptionedFigure"/>
@@ -1985,14 +1985,14 @@
       <w:r>
         <w:drawing>
           <wp:inline>
-            <wp:extent cx="5334000" cy="2642293"/>
+            <wp:extent cx="5334000" cy="4790722"/>
             <wp:effectExtent b="0" l="0" r="0" t="0"/>
-            <wp:docPr descr="System architecture of the RobustCrop pipeline showing the leak-free per-fold design." title="" id="36" name="Picture"/>
+            <wp:docPr descr="Feature correlation heatmap of the primary dataset (Naive Bayes independence check)." title="" id="36" name="Picture"/>
             <a:graphic>
               <a:graphicData uri="http://schemas.openxmlformats.org/drawingml/2006/picture">
                 <pic:pic>
                   <pic:nvPicPr>
-                    <pic:cNvPr descr="01_primary_distributions.png" id="37" name="Picture"/>
+                    <pic:cNvPr descr="03_primary_correlation.png" id="37" name="Picture"/>
                     <pic:cNvPicPr>
                       <a:picLocks noChangeArrowheads="1" noChangeAspect="1"/>
                     </pic:cNvPicPr>
@@ -2006,7 +2006,7 @@
                   <pic:spPr bwMode="auto">
                     <a:xfrm>
                       <a:off x="0" y="0"/>
-                      <a:ext cx="5334000" cy="2642293"/>
+                      <a:ext cx="5334000" cy="4790722"/>
                     </a:xfrm>
                     <a:prstGeom prst="rect">
                       <a:avLst/>
@@ -2030,7 +2030,7 @@
         <w:pStyle w:val="ImageCaption"/>
       </w:pPr>
       <w:r>
-        <w:t xml:space="preserve">System architecture of the RobustCrop pipeline showing the leak-free per-fold design.</w:t>
+        <w:t xml:space="preserve">Feature correlation heatmap of the primary dataset (Naive Bayes independence check).</w:t>
       </w:r>
     </w:p>
     <w:bookmarkEnd w:id="38"/>
@@ -4547,7 +4547,7 @@
     </w:p>
     <w:bookmarkEnd w:id="46"/>
     <w:bookmarkEnd w:id="47"/>
-    <w:bookmarkStart w:id="80" w:name="results-and-analysis"/>
+    <w:bookmarkStart w:id="105" w:name="results-and-analysis"/>
     <w:p>
       <w:pPr>
         <w:pStyle w:val="Heading1"/>
@@ -4565,7 +4565,7 @@
         <w:t xml:space="preserve">Results and Analysis</w:t>
       </w:r>
     </w:p>
-    <w:bookmarkStart w:id="57" w:name="feature-selection-consensus-ranking-1"/>
+    <w:bookmarkStart w:id="74" w:name="feature-selection-consensus-ranking-1"/>
     <w:p>
       <w:pPr>
         <w:pStyle w:val="Heading2"/>
@@ -4583,7 +4583,7 @@
         <w:t xml:space="preserve">Feature Selection: Consensus Ranking</w:t>
       </w:r>
     </w:p>
-    <w:bookmarkStart w:id="48" w:name="primary-dataset-7-features"/>
+    <w:bookmarkStart w:id="52" w:name="primary-dataset-7-features"/>
     <w:p>
       <w:pPr>
         <w:pStyle w:val="Heading3"/>
@@ -4979,11 +4979,71 @@
         <w:t xml:space="preserve">potassium (K)</w:t>
       </w:r>
       <w:r>
-        <w:t xml:space="preserve">. The dominance of climate features over soil nutrients suggests that macro-environmental conditions are the primary driver of crop suitability.</w:t>
-      </w:r>
-    </w:p>
-    <w:bookmarkEnd w:id="48"/>
-    <w:bookmarkStart w:id="56" w:name="secondary-dataset-12-features"/>
+        <w:t xml:space="preserve"> </w:t>
+      </w:r>
+      <w:r>
+        <w:t xml:space="preserve">(Figure 4). The dominance of climate features over soil nutrients suggests that macro-environmental conditions are the primary driver of crop suitability.</w:t>
+      </w:r>
+    </w:p>
+    <w:bookmarkStart w:id="51" w:name="fig:fs_primary"/>
+    <w:p>
+      <w:pPr>
+        <w:pStyle w:val="CaptionedFigure"/>
+      </w:pPr>
+      <w:r>
+        <w:drawing>
+          <wp:inline>
+            <wp:extent cx="5334000" cy="3168437"/>
+            <wp:effectExtent b="0" l="0" r="0" t="0"/>
+            <wp:docPr descr="Feature selection consensus ranking for the primary dataset across six methods." title="" id="49" name="Picture"/>
+            <a:graphic>
+              <a:graphicData uri="http://schemas.openxmlformats.org/drawingml/2006/picture">
+                <pic:pic>
+                  <pic:nvPicPr>
+                    <pic:cNvPr descr="08_feature_selection.png" id="50" name="Picture"/>
+                    <pic:cNvPicPr>
+                      <a:picLocks noChangeArrowheads="1" noChangeAspect="1"/>
+                    </pic:cNvPicPr>
+                  </pic:nvPicPr>
+                  <pic:blipFill>
+                    <a:blip r:embed="rId48"/>
+                    <a:stretch>
+                      <a:fillRect/>
+                    </a:stretch>
+                  </pic:blipFill>
+                  <pic:spPr bwMode="auto">
+                    <a:xfrm>
+                      <a:off x="0" y="0"/>
+                      <a:ext cx="5334000" cy="3168437"/>
+                    </a:xfrm>
+                    <a:prstGeom prst="rect">
+                      <a:avLst/>
+                    </a:prstGeom>
+                    <a:noFill/>
+                    <a:ln w="9525">
+                      <a:noFill/>
+                      <a:headEnd/>
+                      <a:tailEnd/>
+                    </a:ln>
+                  </pic:spPr>
+                </pic:pic>
+              </a:graphicData>
+            </a:graphic>
+          </wp:inline>
+        </w:drawing>
+      </w:r>
+    </w:p>
+    <w:p>
+      <w:pPr>
+        <w:pStyle w:val="ImageCaption"/>
+      </w:pPr>
+      <w:r>
+        <w:t xml:space="preserve">Feature selection consensus ranking for the primary dataset across six methods.</w:t>
+      </w:r>
+    </w:p>
+    <w:bookmarkEnd w:id="51"/>
+    <w:bookmarkEnd w:id="52"/>
+    <w:bookmarkStart w:id="73" w:name="secondary-dataset-12-features"/>
     <w:p>
       <w:pPr>
         <w:pStyle w:val="Heading3"/>
@@ -5540,10 +5600,10 @@
         <w:t xml:space="preserve"> </w:t>
       </w:r>
       <w:r>
-        <w:t xml:space="preserve">dominate — contrary to the primary dataset where macronutrients (N, P, K) are mid-ranked.</w:t>
-      </w:r>
-    </w:p>
-    <w:bookmarkStart w:id="51" w:name="fig:primary_dist"/>
+        <w:t xml:space="preserve">dominate (Figure 5) — contrary to the primary dataset where macronutrients (N, P, K) are mid-ranked.</w:t>
+      </w:r>
+    </w:p>
+    <w:bookmarkStart w:id="56" w:name="fig:fs_secondary"/>
     <w:p>
       <w:pPr>
         <w:pStyle w:val="CaptionedFigure"/>
@@ -5551,20 +5611,77 @@
       <w:r>
         <w:drawing>
           <wp:inline>
-            <wp:extent cx="5334000" cy="2642293"/>
+            <wp:extent cx="5334000" cy="3168437"/>
             <wp:effectExtent b="0" l="0" r="0" t="0"/>
-            <wp:docPr descr="Feature distributions of the primary (semi-synthetic) crop recommendation dataset." title="" id="49" name="Picture"/>
+            <wp:docPr descr="Feature selection consensus ranking for the secondary dataset." title="" id="54" name="Picture"/>
             <a:graphic>
               <a:graphicData uri="http://schemas.openxmlformats.org/drawingml/2006/picture">
                 <pic:pic>
                   <pic:nvPicPr>
-                    <pic:cNvPr descr="01_primary_distributions.png" id="50" name="Picture"/>
+                    <pic:cNvPr descr="09_feature_selection_secondary.png" id="55" name="Picture"/>
                     <pic:cNvPicPr>
                       <a:picLocks noChangeArrowheads="1" noChangeAspect="1"/>
                     </pic:cNvPicPr>
                   </pic:nvPicPr>
                   <pic:blipFill>
-                    <a:blip r:embed="rId35"/>
+                    <a:blip r:embed="rId53"/>
+                    <a:stretch>
+                      <a:fillRect/>
+                    </a:stretch>
+                  </pic:blipFill>
+                  <pic:spPr bwMode="auto">
+                    <a:xfrm>
+                      <a:off x="0" y="0"/>
+                      <a:ext cx="5334000" cy="3168437"/>
+                    </a:xfrm>
+                    <a:prstGeom prst="rect">
+                      <a:avLst/>
+                    </a:prstGeom>
+                    <a:noFill/>
+                    <a:ln w="9525">
+                      <a:noFill/>
+                      <a:headEnd/>
+                      <a:tailEnd/>
+                    </a:ln>
+                  </pic:spPr>
+                </pic:pic>
+              </a:graphicData>
+            </a:graphic>
+          </wp:inline>
+        </w:drawing>
+      </w:r>
+    </w:p>
+    <w:p>
+      <w:pPr>
+        <w:pStyle w:val="ImageCaption"/>
+      </w:pPr>
+      <w:r>
+        <w:t xml:space="preserve">Feature selection consensus ranking for the secondary dataset.</w:t>
+      </w:r>
+    </w:p>
+    <w:bookmarkEnd w:id="56"/>
+    <w:bookmarkStart w:id="60" w:name="fig:primary_dist"/>
+    <w:p>
+      <w:pPr>
+        <w:pStyle w:val="CaptionedFigure"/>
+      </w:pPr>
+      <w:r>
+        <w:drawing>
+          <wp:inline>
+            <wp:extent cx="5334000" cy="2642293"/>
+            <wp:effectExtent b="0" l="0" r="0" t="0"/>
+            <wp:docPr descr="Feature distributions of the primary (semi-synthetic) crop recommendation dataset." title="" id="58" name="Picture"/>
+            <a:graphic>
+              <a:graphicData uri="http://schemas.openxmlformats.org/drawingml/2006/picture">
+                <pic:pic>
+                  <pic:nvPicPr>
+                    <pic:cNvPr descr="01_primary_distributions.png" id="59" name="Picture"/>
+                    <pic:cNvPicPr>
+                      <a:picLocks noChangeArrowheads="1" noChangeAspect="1"/>
+                    </pic:cNvPicPr>
+                  </pic:nvPicPr>
+                  <pic:blipFill>
+                    <a:blip r:embed="rId57"/>
                     <a:stretch>
                       <a:fillRect/>
                     </a:stretch>
@@ -5599,8 +5716,8 @@
         <w:t xml:space="preserve">Feature distributions of the primary (semi-synthetic) crop recommendation dataset.</w:t>
       </w:r>
     </w:p>
-    <w:bookmarkEnd w:id="51"/>
-    <w:bookmarkStart w:id="55" w:name="fig:secondary_dist"/>
+    <w:bookmarkEnd w:id="60"/>
+    <w:bookmarkStart w:id="64" w:name="fig:secondary_dist"/>
     <w:p>
       <w:pPr>
         <w:pStyle w:val="CaptionedFigure"/>
@@ -5610,18 +5727,18 @@
           <wp:inline>
             <wp:extent cx="5334000" cy="3359351"/>
             <wp:effectExtent b="0" l="0" r="0" t="0"/>
-            <wp:docPr descr="Feature distributions of the secondary (real) soil fertility dataset." title="" id="53" name="Picture"/>
+            <wp:docPr descr="Feature distributions of the secondary (real) soil fertility dataset." title="" id="62" name="Picture"/>
             <a:graphic>
               <a:graphicData uri="http://schemas.openxmlformats.org/drawingml/2006/picture">
                 <pic:pic>
                   <pic:nvPicPr>
-                    <pic:cNvPr descr="02_secondary_distributions.png" id="54" name="Picture"/>
+                    <pic:cNvPr descr="02_secondary_distributions.png" id="63" name="Picture"/>
                     <pic:cNvPicPr>
                       <a:picLocks noChangeArrowheads="1" noChangeAspect="1"/>
                     </pic:cNvPicPr>
                   </pic:nvPicPr>
                   <pic:blipFill>
-                    <a:blip r:embed="rId52"/>
+                    <a:blip r:embed="rId61"/>
                     <a:stretch>
                       <a:fillRect/>
                     </a:stretch>
@@ -5656,10 +5773,124 @@
         <w:t xml:space="preserve">Feature distributions of the secondary (real) soil fertility dataset.</w:t>
       </w:r>
     </w:p>
-    <w:bookmarkEnd w:id="55"/>
-    <w:bookmarkEnd w:id="56"/>
-    <w:bookmarkEnd w:id="57"/>
-    <w:bookmarkStart w:id="62" w:name="X7a20b1ee25f83f865335e43a6614171b74aba36"/>
+    <w:bookmarkEnd w:id="64"/>
+    <w:bookmarkStart w:id="68" w:name="fig:secondary_corr"/>
+    <w:p>
+      <w:pPr>
+        <w:pStyle w:val="CaptionedFigure"/>
+      </w:pPr>
+      <w:r>
+        <w:drawing>
+          <wp:inline>
+            <wp:extent cx="5334000" cy="4711553"/>
+            <wp:effectExtent b="0" l="0" r="0" t="0"/>
+            <wp:docPr descr="Feature correlation heatmap of the secondary dataset." title="" id="66" name="Picture"/>
+            <a:graphic>
+              <a:graphicData uri="http://schemas.openxmlformats.org/drawingml/2006/picture">
+                <pic:pic>
+                  <pic:nvPicPr>
+                    <pic:cNvPr descr="04_secondary_correlation.png" id="67" name="Picture"/>
+                    <pic:cNvPicPr>
+                      <a:picLocks noChangeArrowheads="1" noChangeAspect="1"/>
+                    </pic:cNvPicPr>
+                  </pic:nvPicPr>
+                  <pic:blipFill>
+                    <a:blip r:embed="rId65"/>
+                    <a:stretch>
+                      <a:fillRect/>
+                    </a:stretch>
+                  </pic:blipFill>
+                  <pic:spPr bwMode="auto">
+                    <a:xfrm>
+                      <a:off x="0" y="0"/>
+                      <a:ext cx="5334000" cy="4711553"/>
+                    </a:xfrm>
+                    <a:prstGeom prst="rect">
+                      <a:avLst/>
+                    </a:prstGeom>
+                    <a:noFill/>
+                    <a:ln w="9525">
+                      <a:noFill/>
+                      <a:headEnd/>
+                      <a:tailEnd/>
+                    </a:ln>
+                  </pic:spPr>
+                </pic:pic>
+              </a:graphicData>
+            </a:graphic>
+          </wp:inline>
+        </w:drawing>
+      </w:r>
+    </w:p>
+    <w:p>
+      <w:pPr>
+        <w:pStyle w:val="ImageCaption"/>
+      </w:pPr>
+      <w:r>
+        <w:t xml:space="preserve">Feature correlation heatmap of the secondary dataset.</w:t>
+      </w:r>
+    </w:p>
+    <w:bookmarkEnd w:id="68"/>
+    <w:bookmarkStart w:id="72" w:name="fig:class_dist"/>
+    <w:p>
+      <w:pPr>
+        <w:pStyle w:val="CaptionedFigure"/>
+      </w:pPr>
+      <w:r>
+        <w:drawing>
+          <wp:inline>
+            <wp:extent cx="5334000" cy="1651884"/>
+            <wp:effectExtent b="0" l="0" r="0" t="0"/>
+            <wp:docPr descr="Class distribution comparison across both datasets." title="" id="70" name="Picture"/>
+            <a:graphic>
+              <a:graphicData uri="http://schemas.openxmlformats.org/drawingml/2006/picture">
+                <pic:pic>
+                  <pic:nvPicPr>
+                    <pic:cNvPr descr="05_class_distributions.png" id="71" name="Picture"/>
+                    <pic:cNvPicPr>
+                      <a:picLocks noChangeArrowheads="1" noChangeAspect="1"/>
+                    </pic:cNvPicPr>
+                  </pic:nvPicPr>
+                  <pic:blipFill>
+                    <a:blip r:embed="rId69"/>
+                    <a:stretch>
+                      <a:fillRect/>
+                    </a:stretch>
+                  </pic:blipFill>
+                  <pic:spPr bwMode="auto">
+                    <a:xfrm>
+                      <a:off x="0" y="0"/>
+                      <a:ext cx="5334000" cy="1651884"/>
+                    </a:xfrm>
+                    <a:prstGeom prst="rect">
+                      <a:avLst/>
+                    </a:prstGeom>
+                    <a:noFill/>
+                    <a:ln w="9525">
+                      <a:noFill/>
+                      <a:headEnd/>
+                      <a:tailEnd/>
+                    </a:ln>
+                  </pic:spPr>
+                </pic:pic>
+              </a:graphicData>
+            </a:graphic>
+          </wp:inline>
+        </w:drawing>
+      </w:r>
+    </w:p>
+    <w:p>
+      <w:pPr>
+        <w:pStyle w:val="ImageCaption"/>
+      </w:pPr>
+      <w:r>
+        <w:t xml:space="preserve">Class distribution comparison across both datasets.</w:t>
+      </w:r>
+    </w:p>
+    <w:bookmarkEnd w:id="72"/>
+    <w:bookmarkEnd w:id="73"/>
+    <w:bookmarkEnd w:id="74"/>
+    <w:bookmarkStart w:id="79" w:name="X7a20b1ee25f83f865335e43a6614171b74aba36"/>
     <w:p>
       <w:pPr>
         <w:pStyle w:val="Heading2"/>
@@ -6723,7 +6954,7 @@
         </w:tc>
       </w:tr>
     </w:tbl>
-    <w:bookmarkStart w:id="61" w:name="fig:cv"/>
+    <w:bookmarkStart w:id="78" w:name="fig:cv"/>
     <w:p>
       <w:pPr>
         <w:pStyle w:val="CaptionedFigure"/>
@@ -6733,18 +6964,18 @@
           <wp:inline>
             <wp:extent cx="5334000" cy="2114014"/>
             <wp:effectExtent b="0" l="0" r="0" t="0"/>
-            <wp:docPr descr="Cross-validation comparison across classifiers on both datasets." title="" id="59" name="Picture"/>
+            <wp:docPr descr="Cross-validation comparison across classifiers on both datasets." title="" id="76" name="Picture"/>
             <a:graphic>
               <a:graphicData uri="http://schemas.openxmlformats.org/drawingml/2006/picture">
                 <pic:pic>
                   <pic:nvPicPr>
-                    <pic:cNvPr descr="10_cv_comparison.png" id="60" name="Picture"/>
+                    <pic:cNvPr descr="10_cv_comparison.png" id="77" name="Picture"/>
                     <pic:cNvPicPr>
                       <a:picLocks noChangeArrowheads="1" noChangeAspect="1"/>
                     </pic:cNvPicPr>
                   </pic:nvPicPr>
                   <pic:blipFill>
-                    <a:blip r:embed="rId58"/>
+                    <a:blip r:embed="rId75"/>
                     <a:stretch>
                       <a:fillRect/>
                     </a:stretch>
@@ -6779,9 +7010,9 @@
         <w:t xml:space="preserve">Cross-validation comparison across classifiers on both datasets.</w:t>
       </w:r>
     </w:p>
-    <w:bookmarkEnd w:id="61"/>
-    <w:bookmarkEnd w:id="62"/>
-    <w:bookmarkStart w:id="63" w:name="X851d27663a7538d7f766c6bc4e2b2cb44b81e95"/>
+    <w:bookmarkEnd w:id="78"/>
+    <w:bookmarkEnd w:id="79"/>
+    <w:bookmarkStart w:id="80" w:name="X851d27663a7538d7f766c6bc4e2b2cb44b81e95"/>
     <w:p>
       <w:pPr>
         <w:pStyle w:val="Heading2"/>
@@ -7926,8 +8157,8 @@
         <w:t xml:space="preserve">applied, LightGBM achieves 90.34% — competitive with XGBoost.</w:t>
       </w:r>
     </w:p>
-    <w:bookmarkEnd w:id="63"/>
-    <w:bookmarkStart w:id="64" w:name="feature-subset-ablation"/>
+    <w:bookmarkEnd w:id="80"/>
+    <w:bookmarkStart w:id="81" w:name="feature-subset-ablation"/>
     <w:p>
       <w:pPr>
         <w:pStyle w:val="Heading2"/>
@@ -8255,8 +8486,8 @@
         <w:t xml:space="preserve">with minimal accuracy loss.</w:t>
       </w:r>
     </w:p>
-    <w:bookmarkEnd w:id="64"/>
-    <w:bookmarkStart w:id="69" w:name="sensor-degradation-robustness"/>
+    <w:bookmarkEnd w:id="81"/>
+    <w:bookmarkStart w:id="90" w:name="sensor-degradation-robustness"/>
     <w:p>
       <w:pPr>
         <w:pStyle w:val="Heading2"/>
@@ -8690,44 +8921,10 @@
         <w:pStyle w:val="BodyText"/>
       </w:pPr>
       <w:r>
-        <w:t xml:space="preserve">Performance degrades monotonically under sensor drift (Figure 5). The compounding effect of directional drift across correlated sensors explains the non-linear collapse.</w:t>
-      </w:r>
-    </w:p>
-    <w:p>
-      <w:pPr>
-        <w:pStyle w:val="BodyText"/>
-      </w:pPr>
-      <w:r>
-        <w:rPr>
-          <w:b/>
-          <w:bCs/>
-        </w:rPr>
-        <w:t xml:space="preserve">Practical recalibration guidance:</w:t>
-      </w:r>
-      <w:r>
-        <w:t xml:space="preserve"> </w:t>
-      </w:r>
-      <w:r>
-        <w:t xml:space="preserve">Weekly sensor recalibration maintains &gt;94% accuracy; monthly recalibration is insufficient (70.41%). The steep degradation curve means that</w:t>
-      </w:r>
-      <w:r>
-        <w:t xml:space="preserve"> </w:t>
-      </w:r>
-      <w:r>
-        <w:rPr>
-          <w:b/>
-          <w:bCs/>
-        </w:rPr>
-        <w:t xml:space="preserve">weekly recalibration is mandatory</w:t>
-      </w:r>
-      <w:r>
-        <w:t xml:space="preserve"> </w:t>
-      </w:r>
-      <w:r>
-        <w:t xml:space="preserve">for deployment reliability.</w:t>
-      </w:r>
-    </w:p>
-    <w:bookmarkStart w:id="68" w:name="fig:robustness"/>
+        <w:t xml:space="preserve">Performance degrades monotonically under sensor drift (Figure 9). The compounding effect of directional drift across correlated sensors explains the non-linear collapse.</w:t>
+      </w:r>
+    </w:p>
+    <w:bookmarkStart w:id="85" w:name="fig:degradation_comp"/>
     <w:p>
       <w:pPr>
         <w:pStyle w:val="CaptionedFigure"/>
@@ -8735,20 +8932,111 @@
       <w:r>
         <w:drawing>
           <wp:inline>
-            <wp:extent cx="5334000" cy="1766789"/>
+            <wp:extent cx="5334000" cy="1763016"/>
             <wp:effectExtent b="0" l="0" r="0" t="0"/>
-            <wp:docPr descr="Sensor degradation robustness: accuracy under mild (7-day), moderate (30-day), and severe (90-day) monotonic drift." title="" id="66" name="Picture"/>
+            <wp:docPr descr="Degradation comparison across sensor types and deployment durations." title="" id="83" name="Picture"/>
             <a:graphic>
               <a:graphicData uri="http://schemas.openxmlformats.org/drawingml/2006/picture">
                 <pic:pic>
                   <pic:nvPicPr>
-                    <pic:cNvPr descr="12_robustness.png" id="67" name="Picture"/>
+                    <pic:cNvPr descr="06_degradation_comparison.png" id="84" name="Picture"/>
                     <pic:cNvPicPr>
                       <a:picLocks noChangeArrowheads="1" noChangeAspect="1"/>
                     </pic:cNvPicPr>
                   </pic:nvPicPr>
                   <pic:blipFill>
-                    <a:blip r:embed="rId65"/>
+                    <a:blip r:embed="rId82"/>
+                    <a:stretch>
+                      <a:fillRect/>
+                    </a:stretch>
+                  </pic:blipFill>
+                  <pic:spPr bwMode="auto">
+                    <a:xfrm>
+                      <a:off x="0" y="0"/>
+                      <a:ext cx="5334000" cy="1763016"/>
+                    </a:xfrm>
+                    <a:prstGeom prst="rect">
+                      <a:avLst/>
+                    </a:prstGeom>
+                    <a:noFill/>
+                    <a:ln w="9525">
+                      <a:noFill/>
+                      <a:headEnd/>
+                      <a:tailEnd/>
+                    </a:ln>
+                  </pic:spPr>
+                </pic:pic>
+              </a:graphicData>
+            </a:graphic>
+          </wp:inline>
+        </w:drawing>
+      </w:r>
+    </w:p>
+    <w:p>
+      <w:pPr>
+        <w:pStyle w:val="ImageCaption"/>
+      </w:pPr>
+      <w:r>
+        <w:t xml:space="preserve">Degradation comparison across sensor types and deployment durations.</w:t>
+      </w:r>
+    </w:p>
+    <w:bookmarkEnd w:id="85"/>
+    <w:p>
+      <w:pPr>
+        <w:pStyle w:val="BodyText"/>
+      </w:pPr>
+      <w:r>
+        <w:rPr>
+          <w:b/>
+          <w:bCs/>
+        </w:rPr>
+        <w:t xml:space="preserve">Practical recalibration guidance:</w:t>
+      </w:r>
+      <w:r>
+        <w:t xml:space="preserve"> </w:t>
+      </w:r>
+      <w:r>
+        <w:t xml:space="preserve">Weekly sensor recalibration maintains &gt;94% accuracy; monthly recalibration is insufficient (70.41%). The steep degradation curve means that</w:t>
+      </w:r>
+      <w:r>
+        <w:t xml:space="preserve"> </w:t>
+      </w:r>
+      <w:r>
+        <w:rPr>
+          <w:b/>
+          <w:bCs/>
+        </w:rPr>
+        <w:t xml:space="preserve">weekly recalibration is mandatory</w:t>
+      </w:r>
+      <w:r>
+        <w:t xml:space="preserve"> </w:t>
+      </w:r>
+      <w:r>
+        <w:t xml:space="preserve">for deployment reliability.</w:t>
+      </w:r>
+    </w:p>
+    <w:bookmarkStart w:id="89" w:name="fig:robustness"/>
+    <w:p>
+      <w:pPr>
+        <w:pStyle w:val="CaptionedFigure"/>
+      </w:pPr>
+      <w:r>
+        <w:drawing>
+          <wp:inline>
+            <wp:extent cx="5334000" cy="1766789"/>
+            <wp:effectExtent b="0" l="0" r="0" t="0"/>
+            <wp:docPr descr="Sensor degradation robustness: accuracy under mild (7-day), moderate (30-day), and severe (90-day) monotonic drift." title="" id="87" name="Picture"/>
+            <a:graphic>
+              <a:graphicData uri="http://schemas.openxmlformats.org/drawingml/2006/picture">
+                <pic:pic>
+                  <pic:nvPicPr>
+                    <pic:cNvPr descr="12_robustness.png" id="88" name="Picture"/>
+                    <pic:cNvPicPr>
+                      <a:picLocks noChangeArrowheads="1" noChangeAspect="1"/>
+                    </pic:cNvPicPr>
+                  </pic:nvPicPr>
+                  <pic:blipFill>
+                    <a:blip r:embed="rId86"/>
                     <a:stretch>
                       <a:fillRect/>
                     </a:stretch>
@@ -8783,9 +9071,9 @@
         <w:t xml:space="preserve">Sensor degradation robustness: accuracy under mild (7-day), moderate (30-day), and severe (90-day) monotonic drift.</w:t>
       </w:r>
     </w:p>
-    <w:bookmarkEnd w:id="68"/>
-    <w:bookmarkEnd w:id="69"/>
-    <w:bookmarkStart w:id="74" w:name="shap-explainability-analysis"/>
+    <w:bookmarkEnd w:id="89"/>
+    <w:bookmarkEnd w:id="90"/>
+    <w:bookmarkStart w:id="99" w:name="shap-explainability-analysis"/>
     <w:p>
       <w:pPr>
         <w:pStyle w:val="Heading2"/>
@@ -9269,7 +9557,7 @@
         <w:t xml:space="preserve">.</w:t>
       </w:r>
     </w:p>
-    <w:bookmarkStart w:id="73" w:name="fig:shap"/>
+    <w:bookmarkStart w:id="94" w:name="fig:shap_rf"/>
     <w:p>
       <w:pPr>
         <w:pStyle w:val="CaptionedFigure"/>
@@ -9279,18 +9567,18 @@
           <wp:inline>
             <wp:extent cx="5334000" cy="3148529"/>
             <wp:effectExtent b="0" l="0" r="0" t="0"/>
-            <wp:docPr descr="SHAP feature importance for the Random Forest classifier on the primary dataset." title="" id="71" name="Picture"/>
+            <wp:docPr descr="SHAP feature importance for the Random Forest classifier on the primary dataset." title="" id="92" name="Picture"/>
             <a:graphic>
               <a:graphicData uri="http://schemas.openxmlformats.org/drawingml/2006/picture">
                 <pic:pic>
                   <pic:nvPicPr>
-                    <pic:cNvPr descr="11_shap_RandomForest.png" id="72" name="Picture"/>
+                    <pic:cNvPr descr="11_shap_RandomForest.png" id="93" name="Picture"/>
                     <pic:cNvPicPr>
                       <a:picLocks noChangeArrowheads="1" noChangeAspect="1"/>
                     </pic:cNvPicPr>
                   </pic:nvPicPr>
                   <pic:blipFill>
-                    <a:blip r:embed="rId70"/>
+                    <a:blip r:embed="rId91"/>
                     <a:stretch>
                       <a:fillRect/>
                     </a:stretch>
@@ -9325,9 +9613,66 @@
         <w:t xml:space="preserve">SHAP feature importance for the Random Forest classifier on the primary dataset.</w:t>
       </w:r>
     </w:p>
-    <w:bookmarkEnd w:id="73"/>
-    <w:bookmarkEnd w:id="74"/>
-    <w:bookmarkStart w:id="79" w:name="cross-dataset-feature-consistency"/>
+    <w:bookmarkEnd w:id="94"/>
+    <w:bookmarkStart w:id="98" w:name="fig:shap_nb"/>
+    <w:p>
+      <w:pPr>
+        <w:pStyle w:val="CaptionedFigure"/>
+      </w:pPr>
+      <w:r>
+        <w:drawing>
+          <wp:inline>
+            <wp:extent cx="5334000" cy="3148529"/>
+            <wp:effectExtent b="0" l="0" r="0" t="0"/>
+            <wp:docPr descr="SHAP feature importance for the GaussianNB classifier on the primary dataset." title="" id="96" name="Picture"/>
+            <a:graphic>
+              <a:graphicData uri="http://schemas.openxmlformats.org/drawingml/2006/picture">
+                <pic:pic>
+                  <pic:nvPicPr>
+                    <pic:cNvPr descr="11_shap_GaussianNB.png" id="97" name="Picture"/>
+                    <pic:cNvPicPr>
+                      <a:picLocks noChangeArrowheads="1" noChangeAspect="1"/>
+                    </pic:cNvPicPr>
+                  </pic:nvPicPr>
+                  <pic:blipFill>
+                    <a:blip r:embed="rId95"/>
+                    <a:stretch>
+                      <a:fillRect/>
+                    </a:stretch>
+                  </pic:blipFill>
+                  <pic:spPr bwMode="auto">
+                    <a:xfrm>
+                      <a:off x="0" y="0"/>
+                      <a:ext cx="5334000" cy="3148529"/>
+                    </a:xfrm>
+                    <a:prstGeom prst="rect">
+                      <a:avLst/>
+                    </a:prstGeom>
+                    <a:noFill/>
+                    <a:ln w="9525">
+                      <a:noFill/>
+                      <a:headEnd/>
+                      <a:tailEnd/>
+                    </a:ln>
+                  </pic:spPr>
+                </pic:pic>
+              </a:graphicData>
+            </a:graphic>
+          </wp:inline>
+        </w:drawing>
+      </w:r>
+    </w:p>
+    <w:p>
+      <w:pPr>
+        <w:pStyle w:val="ImageCaption"/>
+      </w:pPr>
+      <w:r>
+        <w:t xml:space="preserve">SHAP feature importance for the GaussianNB classifier on the primary dataset.</w:t>
+      </w:r>
+    </w:p>
+    <w:bookmarkEnd w:id="98"/>
+    <w:bookmarkEnd w:id="99"/>
+    <w:bookmarkStart w:id="104" w:name="cross-dataset-feature-consistency"/>
     <w:p>
       <w:pPr>
         <w:pStyle w:val="Heading2"/>
@@ -9843,7 +10188,7 @@
         <w:t xml:space="preserve">(0.293). This divergence underscores that feature importance should not be generalised from a single dataset.</w:t>
       </w:r>
     </w:p>
-    <w:bookmarkStart w:id="78" w:name="fig:cross_dataset"/>
+    <w:bookmarkStart w:id="103" w:name="fig:cross_dataset"/>
     <w:p>
       <w:pPr>
         <w:pStyle w:val="CaptionedFigure"/>
@@ -9853,18 +10198,18 @@
           <wp:inline>
             <wp:extent cx="5334000" cy="3789201"/>
             <wp:effectExtent b="0" l="0" r="0" t="0"/>
-            <wp:docPr descr="Cross-dataset feature comparison for shared features (N, P, K)." title="" id="76" name="Picture"/>
+            <wp:docPr descr="Cross-dataset feature comparison for shared features (N, P, K)." title="" id="101" name="Picture"/>
             <a:graphic>
               <a:graphicData uri="http://schemas.openxmlformats.org/drawingml/2006/picture">
                 <pic:pic>
                   <pic:nvPicPr>
-                    <pic:cNvPr descr="07_shared_features_comparison.png" id="77" name="Picture"/>
+                    <pic:cNvPr descr="07_shared_features_comparison.png" id="102" name="Picture"/>
                     <pic:cNvPicPr>
                       <a:picLocks noChangeArrowheads="1" noChangeAspect="1"/>
                     </pic:cNvPicPr>
                   </pic:nvPicPr>
                   <pic:blipFill>
-                    <a:blip r:embed="rId75"/>
+                    <a:blip r:embed="rId100"/>
                     <a:stretch>
                       <a:fillRect/>
                     </a:stretch>
@@ -9899,10 +10244,10 @@
         <w:t xml:space="preserve">Cross-dataset feature comparison for shared features (N, P, K).</w:t>
       </w:r>
     </w:p>
-    <w:bookmarkEnd w:id="78"/>
-    <w:bookmarkEnd w:id="79"/>
-    <w:bookmarkEnd w:id="80"/>
-    <w:bookmarkStart w:id="90" w:name="discussion"/>
+    <w:bookmarkEnd w:id="103"/>
+    <w:bookmarkEnd w:id="104"/>
+    <w:bookmarkEnd w:id="105"/>
+    <w:bookmarkStart w:id="119" w:name="discussion"/>
     <w:p>
       <w:pPr>
         <w:pStyle w:val="Heading1"/>
@@ -9920,7 +10265,7 @@
         <w:t xml:space="preserve">Discussion</w:t>
       </w:r>
     </w:p>
-    <w:bookmarkStart w:id="81" w:name="X91134634362f01e25bf5899beecbff910f774b4"/>
+    <w:bookmarkStart w:id="106" w:name="X91134634362f01e25bf5899beecbff910f774b4"/>
     <w:p>
       <w:pPr>
         <w:pStyle w:val="Heading2"/>
@@ -10020,8 +10365,8 @@
         <w:t xml:space="preserve">RF’s random feature subsampling decorrelates trees and reduces overfitting to the majority class’s feature distribution.</w:t>
       </w:r>
     </w:p>
-    <w:bookmarkEnd w:id="81"/>
-    <w:bookmarkStart w:id="86" w:name="calibration-and-decision-reliability"/>
+    <w:bookmarkEnd w:id="106"/>
+    <w:bookmarkStart w:id="115" w:name="calibration-and-decision-reliability"/>
     <w:p>
       <w:pPr>
         <w:pStyle w:val="Heading2"/>
@@ -10047,7 +10392,7 @@
         <w:t xml:space="preserve">For agricultural deployment, classification accuracy alone is insufficient. Our calibration analysis reveals that Random Forest is moderately well-calibrated (ECE = 0.0430) but tends toward overconfidence. LightGBM achieves the best calibration (ECE = 0.0068), making it preferred when probability estimates are critical. GaussianNB is poorly calibrated despite high accuracy, producing near-0/1 posteriors.</w:t>
       </w:r>
     </w:p>
-    <w:bookmarkStart w:id="85" w:name="fig:calibration"/>
+    <w:bookmarkStart w:id="110" w:name="fig:calibration"/>
     <w:p>
       <w:pPr>
         <w:pStyle w:val="CaptionedFigure"/>
@@ -10057,18 +10402,18 @@
           <wp:inline>
             <wp:extent cx="5334000" cy="1467174"/>
             <wp:effectExtent b="0" l="0" r="0" t="0"/>
-            <wp:docPr descr="Calibration curves for the proposed Random Forest classifier." title="" id="83" name="Picture"/>
+            <wp:docPr descr="Calibration curves for the proposed Random Forest classifier." title="" id="108" name="Picture"/>
             <a:graphic>
               <a:graphicData uri="http://schemas.openxmlformats.org/drawingml/2006/picture">
                 <pic:pic>
                   <pic:nvPicPr>
-                    <pic:cNvPr descr="13_calibration.png" id="84" name="Picture"/>
+                    <pic:cNvPr descr="13_calibration.png" id="109" name="Picture"/>
                     <pic:cNvPicPr>
                       <a:picLocks noChangeArrowheads="1" noChangeAspect="1"/>
                     </pic:cNvPicPr>
                   </pic:nvPicPr>
                   <pic:blipFill>
-                    <a:blip r:embed="rId82"/>
+                    <a:blip r:embed="rId107"/>
                     <a:stretch>
                       <a:fillRect/>
                     </a:stretch>
@@ -10103,9 +10448,66 @@
         <w:t xml:space="preserve">Calibration curves for the proposed Random Forest classifier.</w:t>
       </w:r>
     </w:p>
-    <w:bookmarkEnd w:id="85"/>
-    <w:bookmarkEnd w:id="86"/>
-    <w:bookmarkStart w:id="87" w:name="practical-deployment-guidance"/>
+    <w:bookmarkEnd w:id="110"/>
+    <w:bookmarkStart w:id="114" w:name="fig:perclass"/>
+    <w:p>
+      <w:pPr>
+        <w:pStyle w:val="CaptionedFigure"/>
+      </w:pPr>
+      <w:r>
+        <w:drawing>
+          <wp:inline>
+            <wp:extent cx="5334000" cy="4120644"/>
+            <wp:effectExtent b="0" l="0" r="0" t="0"/>
+            <wp:docPr descr="Per-class F1 score heatmap across all classifiers and datasets." title="" id="112" name="Picture"/>
+            <a:graphic>
+              <a:graphicData uri="http://schemas.openxmlformats.org/drawingml/2006/picture">
+                <pic:pic>
+                  <pic:nvPicPr>
+                    <pic:cNvPr descr="14_per_class_heatmap.png" id="113" name="Picture"/>
+                    <pic:cNvPicPr>
+                      <a:picLocks noChangeArrowheads="1" noChangeAspect="1"/>
+                    </pic:cNvPicPr>
+                  </pic:nvPicPr>
+                  <pic:blipFill>
+                    <a:blip r:embed="rId111"/>
+                    <a:stretch>
+                      <a:fillRect/>
+                    </a:stretch>
+                  </pic:blipFill>
+                  <pic:spPr bwMode="auto">
+                    <a:xfrm>
+                      <a:off x="0" y="0"/>
+                      <a:ext cx="5334000" cy="4120644"/>
+                    </a:xfrm>
+                    <a:prstGeom prst="rect">
+                      <a:avLst/>
+                    </a:prstGeom>
+                    <a:noFill/>
+                    <a:ln w="9525">
+                      <a:noFill/>
+                      <a:headEnd/>
+                      <a:tailEnd/>
+                    </a:ln>
+                  </pic:spPr>
+                </pic:pic>
+              </a:graphicData>
+            </a:graphic>
+          </wp:inline>
+        </w:drawing>
+      </w:r>
+    </w:p>
+    <w:p>
+      <w:pPr>
+        <w:pStyle w:val="ImageCaption"/>
+      </w:pPr>
+      <w:r>
+        <w:t xml:space="preserve">Per-class F1 score heatmap across all classifiers and datasets.</w:t>
+      </w:r>
+    </w:p>
+    <w:bookmarkEnd w:id="114"/>
+    <w:bookmarkEnd w:id="115"/>
+    <w:bookmarkStart w:id="116" w:name="practical-deployment-guidance"/>
     <w:p>
       <w:pPr>
         <w:pStyle w:val="Heading2"/>
@@ -10421,8 +10823,8 @@
         </w:tc>
       </w:tr>
     </w:tbl>
-    <w:bookmarkEnd w:id="87"/>
-    <w:bookmarkStart w:id="88" w:name="limitations"/>
+    <w:bookmarkEnd w:id="116"/>
+    <w:bookmarkStart w:id="117" w:name="limitations"/>
     <w:p>
       <w:pPr>
         <w:pStyle w:val="Heading2"/>
@@ -10528,8 +10930,8 @@
         <w:t xml:space="preserve">Current analysis provides global feature importance. Per-class SHAP breakdowns would provide deeper agronomic insight.</w:t>
       </w:r>
     </w:p>
-    <w:bookmarkEnd w:id="88"/>
-    <w:bookmarkStart w:id="89" w:name="future-work"/>
+    <w:bookmarkEnd w:id="117"/>
+    <w:bookmarkStart w:id="118" w:name="future-work"/>
     <w:p>
       <w:pPr>
         <w:pStyle w:val="Heading2"/>
@@ -10607,9 +11009,9 @@
         <w:t xml:space="preserve">Per-class SHAP analysis for misclassified samples to identify agronomic edge cases.</w:t>
       </w:r>
     </w:p>
-    <w:bookmarkEnd w:id="89"/>
-    <w:bookmarkEnd w:id="90"/>
-    <w:bookmarkStart w:id="91" w:name="conclusion"/>
+    <w:bookmarkEnd w:id="118"/>
+    <w:bookmarkEnd w:id="119"/>
+    <w:bookmarkStart w:id="120" w:name="conclusion"/>
     <w:p>
       <w:pPr>
         <w:pStyle w:val="Heading1"/>
@@ -10909,8 +11311,8 @@
         <w:t xml:space="preserve">These findings provide actionable guidance for deploying ML-based crop recommendation in precision agriculture, from sensor selection and feature engineering to classifier choice and maintenance scheduling.</w:t>
       </w:r>
     </w:p>
-    <w:bookmarkEnd w:id="91"/>
-    <w:bookmarkStart w:id="122" w:name="references"/>
+    <w:bookmarkEnd w:id="120"/>
+    <w:bookmarkStart w:id="151" w:name="references"/>
     <w:p>
       <w:pPr>
         <w:pStyle w:val="Heading1"/>
@@ -10919,8 +11321,8 @@
         <w:t xml:space="preserve">References</w:t>
       </w:r>
     </w:p>
-    <w:bookmarkStart w:id="121" w:name="refs"/>
-    <w:bookmarkStart w:id="93" w:name="ref-WorldBank2023"/>
+    <w:bookmarkStart w:id="150" w:name="refs"/>
+    <w:bookmarkStart w:id="122" w:name="ref-WorldBank2023"/>
     <w:p>
       <w:pPr>
         <w:pStyle w:val="Bibliography"/>
@@ -10952,7 +11354,7 @@
       <w:r>
         <w:t xml:space="preserve"> </w:t>
       </w:r>
-      <w:hyperlink r:id="rId92">
+      <w:hyperlink r:id="rId121">
         <w:r>
           <w:rPr>
             <w:rStyle w:val="Hyperlink"/>
@@ -10961,8 +11363,8 @@
         </w:r>
       </w:hyperlink>
     </w:p>
-    <w:bookmarkEnd w:id="93"/>
-    <w:bookmarkStart w:id="95" w:name="ref-Kapoor2023"/>
+    <w:bookmarkEnd w:id="122"/>
+    <w:bookmarkStart w:id="124" w:name="ref-Kapoor2023"/>
     <w:p>
       <w:pPr>
         <w:pStyle w:val="Bibliography"/>
@@ -11001,7 +11403,7 @@
       <w:r>
         <w:t xml:space="preserve"> </w:t>
       </w:r>
-      <w:hyperlink r:id="rId94">
+      <w:hyperlink r:id="rId123">
         <w:r>
           <w:rPr>
             <w:rStyle w:val="Hyperlink"/>
@@ -11013,8 +11415,8 @@
         <w:t xml:space="preserve">.</w:t>
       </w:r>
     </w:p>
-    <w:bookmarkEnd w:id="95"/>
-    <w:bookmarkStart w:id="97" w:name="ref-Liakos2018"/>
+    <w:bookmarkEnd w:id="124"/>
+    <w:bookmarkStart w:id="126" w:name="ref-Liakos2018"/>
     <w:p>
       <w:pPr>
         <w:pStyle w:val="Bibliography"/>
@@ -11053,7 +11455,7 @@
       <w:r>
         <w:t xml:space="preserve"> </w:t>
       </w:r>
-      <w:hyperlink r:id="rId96">
+      <w:hyperlink r:id="rId125">
         <w:r>
           <w:rPr>
             <w:rStyle w:val="Hyperlink"/>
@@ -11065,8 +11467,8 @@
         <w:t xml:space="preserve">.</w:t>
       </w:r>
     </w:p>
-    <w:bookmarkEnd w:id="97"/>
-    <w:bookmarkStart w:id="99" w:name="ref-Shah2022"/>
+    <w:bookmarkEnd w:id="126"/>
+    <w:bookmarkStart w:id="128" w:name="ref-Shah2022"/>
     <w:p>
       <w:pPr>
         <w:pStyle w:val="Bibliography"/>
@@ -11105,7 +11507,7 @@
       <w:r>
         <w:t xml:space="preserve"> </w:t>
       </w:r>
-      <w:hyperlink r:id="rId98">
+      <w:hyperlink r:id="rId127">
         <w:r>
           <w:rPr>
             <w:rStyle w:val="Hyperlink"/>
@@ -11117,8 +11519,8 @@
         <w:t xml:space="preserve">.</w:t>
       </w:r>
     </w:p>
-    <w:bookmarkEnd w:id="99"/>
-    <w:bookmarkStart w:id="101" w:name="ref-Kamilaris2018"/>
+    <w:bookmarkEnd w:id="128"/>
+    <w:bookmarkStart w:id="130" w:name="ref-Kamilaris2018"/>
     <w:p>
       <w:pPr>
         <w:pStyle w:val="Bibliography"/>
@@ -11157,7 +11559,7 @@
       <w:r>
         <w:t xml:space="preserve"> </w:t>
       </w:r>
-      <w:hyperlink r:id="rId100">
+      <w:hyperlink r:id="rId129">
         <w:r>
           <w:rPr>
             <w:rStyle w:val="Hyperlink"/>
@@ -11169,8 +11571,8 @@
         <w:t xml:space="preserve">.</w:t>
       </w:r>
     </w:p>
-    <w:bookmarkEnd w:id="101"/>
-    <w:bookmarkStart w:id="102" w:name="ref-Guyon2003"/>
+    <w:bookmarkEnd w:id="130"/>
+    <w:bookmarkStart w:id="131" w:name="ref-Guyon2003"/>
     <w:p>
       <w:pPr>
         <w:pStyle w:val="Bibliography"/>
@@ -11207,8 +11609,8 @@
         <w:t xml:space="preserve">, vol. 3, pp. 1157–1182, 2003.</w:t>
       </w:r>
     </w:p>
-    <w:bookmarkEnd w:id="102"/>
-    <w:bookmarkStart w:id="104" w:name="ref-Chandrashekar2014"/>
+    <w:bookmarkEnd w:id="131"/>
+    <w:bookmarkStart w:id="133" w:name="ref-Chandrashekar2014"/>
     <w:p>
       <w:pPr>
         <w:pStyle w:val="Bibliography"/>
@@ -11247,7 +11649,7 @@
       <w:r>
         <w:t xml:space="preserve"> </w:t>
       </w:r>
-      <w:hyperlink r:id="rId103">
+      <w:hyperlink r:id="rId132">
         <w:r>
           <w:rPr>
             <w:rStyle w:val="Hyperlink"/>
@@ -11259,8 +11661,8 @@
         <w:t xml:space="preserve">.</w:t>
       </w:r>
     </w:p>
-    <w:bookmarkEnd w:id="104"/>
-    <w:bookmarkStart w:id="106" w:name="ref-Wolfert2017"/>
+    <w:bookmarkEnd w:id="133"/>
+    <w:bookmarkStart w:id="135" w:name="ref-Wolfert2017"/>
     <w:p>
       <w:pPr>
         <w:pStyle w:val="Bibliography"/>
@@ -11299,7 +11701,7 @@
       <w:r>
         <w:t xml:space="preserve"> </w:t>
       </w:r>
-      <w:hyperlink r:id="rId105">
+      <w:hyperlink r:id="rId134">
         <w:r>
           <w:rPr>
             <w:rStyle w:val="Hyperlink"/>
@@ -11311,8 +11713,8 @@
         <w:t xml:space="preserve">.</w:t>
       </w:r>
     </w:p>
-    <w:bookmarkEnd w:id="106"/>
-    <w:bookmarkStart w:id="108" w:name="ref-Rana2019"/>
+    <w:bookmarkEnd w:id="135"/>
+    <w:bookmarkStart w:id="137" w:name="ref-Rana2019"/>
     <w:p>
       <w:pPr>
         <w:pStyle w:val="Bibliography"/>
@@ -11351,7 +11753,7 @@
       <w:r>
         <w:t xml:space="preserve"> </w:t>
       </w:r>
-      <w:hyperlink r:id="rId107">
+      <w:hyperlink r:id="rId136">
         <w:r>
           <w:rPr>
             <w:rStyle w:val="Hyperlink"/>
@@ -11363,8 +11765,8 @@
         <w:t xml:space="preserve">.</w:t>
       </w:r>
     </w:p>
-    <w:bookmarkEnd w:id="108"/>
-    <w:bookmarkStart w:id="110" w:name="ref-Lobnik2011"/>
+    <w:bookmarkEnd w:id="137"/>
+    <w:bookmarkStart w:id="139" w:name="ref-Lobnik2011"/>
     <w:p>
       <w:pPr>
         <w:pStyle w:val="Bibliography"/>
@@ -11403,7 +11805,7 @@
       <w:r>
         <w:t xml:space="preserve"> </w:t>
       </w:r>
-      <w:hyperlink r:id="rId109">
+      <w:hyperlink r:id="rId138">
         <w:r>
           <w:rPr>
             <w:rStyle w:val="Hyperlink"/>
@@ -11415,8 +11817,8 @@
         <w:t xml:space="preserve">.</w:t>
       </w:r>
     </w:p>
-    <w:bookmarkEnd w:id="110"/>
-    <w:bookmarkStart w:id="111" w:name="ref-Pedregosa2011"/>
+    <w:bookmarkEnd w:id="139"/>
+    <w:bookmarkStart w:id="140" w:name="ref-Pedregosa2011"/>
     <w:p>
       <w:pPr>
         <w:pStyle w:val="Bibliography"/>
@@ -11466,8 +11868,8 @@
         <w:t xml:space="preserve">, vol. 12, pp. 2825–2830, 2011.</w:t>
       </w:r>
     </w:p>
-    <w:bookmarkEnd w:id="111"/>
-    <w:bookmarkStart w:id="113" w:name="ref-Breiman2001"/>
+    <w:bookmarkEnd w:id="140"/>
+    <w:bookmarkStart w:id="142" w:name="ref-Breiman2001"/>
     <w:p>
       <w:pPr>
         <w:pStyle w:val="Bibliography"/>
@@ -11506,7 +11908,7 @@
       <w:r>
         <w:t xml:space="preserve"> </w:t>
       </w:r>
-      <w:hyperlink r:id="rId112">
+      <w:hyperlink r:id="rId141">
         <w:r>
           <w:rPr>
             <w:rStyle w:val="Hyperlink"/>
@@ -11518,8 +11920,8 @@
         <w:t xml:space="preserve">.</w:t>
       </w:r>
     </w:p>
-    <w:bookmarkEnd w:id="113"/>
-    <w:bookmarkStart w:id="114" w:name="ref-Kohavi1995"/>
+    <w:bookmarkEnd w:id="142"/>
+    <w:bookmarkStart w:id="143" w:name="ref-Kohavi1995"/>
     <w:p>
       <w:pPr>
         <w:pStyle w:val="Bibliography"/>
@@ -11562,8 +11964,8 @@
         <w:t xml:space="preserve">, 1995, pp. 1137–1143.</w:t>
       </w:r>
     </w:p>
-    <w:bookmarkEnd w:id="114"/>
-    <w:bookmarkStart w:id="116" w:name="ref-Friedman1937"/>
+    <w:bookmarkEnd w:id="143"/>
+    <w:bookmarkStart w:id="145" w:name="ref-Friedman1937"/>
     <w:p>
       <w:pPr>
         <w:pStyle w:val="Bibliography"/>
@@ -11602,7 +12004,7 @@
       <w:r>
         <w:t xml:space="preserve"> </w:t>
       </w:r>
-      <w:hyperlink r:id="rId115">
+      <w:hyperlink r:id="rId144">
         <w:r>
           <w:rPr>
             <w:rStyle w:val="Hyperlink"/>
@@ -11614,8 +12016,8 @@
         <w:t xml:space="preserve">.</w:t>
       </w:r>
     </w:p>
-    <w:bookmarkEnd w:id="116"/>
-    <w:bookmarkStart w:id="117" w:name="ref-Guo2017"/>
+    <w:bookmarkEnd w:id="145"/>
+    <w:bookmarkStart w:id="146" w:name="ref-Guo2017"/>
     <w:p>
       <w:pPr>
         <w:pStyle w:val="Bibliography"/>
@@ -11658,8 +12060,8 @@
         <w:t xml:space="preserve">, 2017, pp. 1321–1330.</w:t>
       </w:r>
     </w:p>
-    <w:bookmarkEnd w:id="117"/>
-    <w:bookmarkStart w:id="119" w:name="ref-Akiba2019"/>
+    <w:bookmarkEnd w:id="146"/>
+    <w:bookmarkStart w:id="148" w:name="ref-Akiba2019"/>
     <w:p>
       <w:pPr>
         <w:pStyle w:val="Bibliography"/>
@@ -11704,7 +12106,7 @@
       <w:r>
         <w:t xml:space="preserve"> </w:t>
       </w:r>
-      <w:hyperlink r:id="rId118">
+      <w:hyperlink r:id="rId147">
         <w:r>
           <w:rPr>
             <w:rStyle w:val="Hyperlink"/>
@@ -11716,8 +12118,8 @@
         <w:t xml:space="preserve">.</w:t>
       </w:r>
     </w:p>
-    <w:bookmarkEnd w:id="119"/>
-    <w:bookmarkStart w:id="120" w:name="ref-Lundberg2017"/>
+    <w:bookmarkEnd w:id="148"/>
+    <w:bookmarkStart w:id="149" w:name="ref-Lundberg2017"/>
     <w:p>
       <w:pPr>
         <w:pStyle w:val="Bibliography"/>
@@ -11760,9 +12162,9 @@
         <w:t xml:space="preserve">, 2017.</w:t>
       </w:r>
     </w:p>
-    <w:bookmarkEnd w:id="120"/>
-    <w:bookmarkEnd w:id="121"/>
-    <w:bookmarkEnd w:id="122"/>
+    <w:bookmarkEnd w:id="149"/>
+    <w:bookmarkEnd w:id="150"/>
+    <w:bookmarkEnd w:id="151"/>
     <w:sectPr>
       <w:footnotePr>
         <w:numRestart w:val="eachSect"/>

</xml_diff>